<commit_message>
Ebook 2 : ajout de 5 guides illustrés pas-à-pas (flashage & déblocage)
- flash-guides.cjs : bibliothèque de pictogrammes (sauvegarde, phone+USB+PC,
  mode Download/DFU, fenêtre logicielle, barre de progression, IMEI/preuve,
  SIM, code de déblocage…) + générateur de panneaux d'étapes.
- 5 guides : Samsung/Odin, iPhone Recovery/DFU, Fastboot, déblocage réseau
  légal, sortie de bootloop. Insérés aux sections correspondantes.
- Illustrations 100 % dessinées par code (libres de droits). 23 pages.

Co-Authored-By: Claude Opus 4.8 <noreply@anthropic.com>
Claude-Session: https://claude.ai/code/session_01F9fQ6ALPCxv4JUh6nwiR3h
</commit_message>
<xml_diff>
--- a/ebook2/Guide-Flash-Decodage.docx
+++ b/ebook2/Guide-Flash-Decodage.docx
@@ -2194,785 +2194,6 @@
         <w:spacing w:after="80"/>
       </w:pPr>
     </w:p>
-    <w:tbl>
-      <w:tblPr>
-        <w:tblW w:type="pct" w:w="100%"/>
-        <w:tblBorders>
-          <w:top w:val="none" w:color="FFFFFF" w:sz="0"/>
-          <w:left w:val="none" w:color="FFFFFF" w:sz="0"/>
-          <w:bottom w:val="none" w:color="FFFFFF" w:sz="0"/>
-          <w:right w:val="none" w:color="FFFFFF" w:sz="0"/>
-          <w:insideH w:val="none" w:color="FFFFFF" w:sz="0"/>
-          <w:insideV w:val="none" w:color="FFFFFF" w:sz="0"/>
-        </w:tblBorders>
-      </w:tblPr>
-      <w:tblGrid>
-        <w:gridCol w:w="200"/>
-        <w:gridCol w:w="9160"/>
-      </w:tblGrid>
-      <w:tr>
-        <w:tc>
-          <w:tcPr>
-            <w:tcW w:type="dxa" w:w="200"/>
-            <w:shd w:fill="2E5E8C" w:color="auto" w:val="clear"/>
-          </w:tcPr>
-          <w:p>
-            <w:r>
-              <w:rPr>
-                <w:rFonts w:ascii="Calibri" w:cs="Calibri" w:eastAsia="Calibri" w:hAnsi="Calibri"/>
-              </w:rPr>
-              <w:t xml:space="preserve"> </w:t>
-            </w:r>
-          </w:p>
-        </w:tc>
-        <w:tc>
-          <w:tcPr>
-            <w:tcW w:type="dxa" w:w="9160"/>
-            <w:shd w:fill="EAF2FB" w:color="auto" w:val="clear"/>
-            <w:tcMar>
-              <w:top w:type="dxa" w:w="120"/>
-              <w:left w:type="dxa" w:w="160"/>
-              <w:bottom w:type="dxa" w:w="120"/>
-              <w:right w:type="dxa" w:w="160"/>
-            </w:tcMar>
-          </w:tcPr>
-          <w:p>
-            <w:pPr>
-              <w:spacing w:after="40"/>
-            </w:pPr>
-            <w:r>
-              <w:rPr>
-                <w:rFonts w:ascii="Calibri" w:cs="Calibri" w:eastAsia="Calibri" w:hAnsi="Calibri"/>
-                <w:b/>
-                <w:bCs/>
-                <w:color w:val="1F3A5F"/>
-                <w:sz w:val="21"/>
-                <w:szCs w:val="21"/>
-              </w:rPr>
-              <w:t xml:space="preserve">Compteur de flash et sécurité</w:t>
-            </w:r>
-          </w:p>
-          <w:p>
-            <w:r>
-              <w:rPr>
-                <w:rFonts w:ascii="Calibri" w:cs="Calibri" w:eastAsia="Calibri" w:hAnsi="Calibri"/>
-                <w:color w:val="222222"/>
-                <w:sz w:val="21"/>
-                <w:szCs w:val="21"/>
-              </w:rPr>
-              <w:t xml:space="preserve">Certains fabricants enregistrent les flashages non officiels (compteur, indicateur de garantie). Un flash de firmware OFFICIEL est sans risque ; un firmware modifié peut affecter la garantie et certaines fonctions de sécurité. Informez le client.</w:t>
-            </w:r>
-          </w:p>
-        </w:tc>
-      </w:tr>
-    </w:tbl>
-    <w:p>
-      <w:pPr>
-        <w:spacing w:after="80"/>
-      </w:pPr>
-    </w:p>
-    <w:p>
-      <w:pPr>
-        <w:pStyle w:val="Heading2"/>
-        <w:spacing w:after="100" w:before="220"/>
-      </w:pPr>
-      <w:r>
-        <w:rPr>
-          <w:rFonts w:ascii="Calibri" w:cs="Calibri" w:eastAsia="Calibri" w:hAnsi="Calibri"/>
-          <w:b/>
-          <w:bCs/>
-          <w:color w:val="2E5E8C"/>
-          <w:sz w:val="26"/>
-          <w:szCs w:val="26"/>
-        </w:rPr>
-        <w:t xml:space="preserve">8. Fastboot (Pixel et nombreux Android)</w:t>
-      </w:r>
-    </w:p>
-    <w:p>
-      <w:pPr>
-        <w:pStyle w:val="ListParagraph"/>
-        <w:numPr>
-          <w:ilvl w:val="0"/>
-          <w:numId w:val="2"/>
-        </w:numPr>
-        <w:spacing w:after="60" w:line="264"/>
-      </w:pPr>
-      <w:r>
-        <w:rPr>
-          <w:rFonts w:ascii="Calibri" w:cs="Calibri" w:eastAsia="Calibri" w:hAnsi="Calibri"/>
-          <w:sz w:val="22"/>
-          <w:szCs w:val="22"/>
-        </w:rPr>
-        <w:t xml:space="preserve">Activer le débogage USB et, si nécessaire et autorisé par le constructeur, le déverrouillage OEM (voir Partie 6 pour les implications).</w:t>
-      </w:r>
-    </w:p>
-    <w:p>
-      <w:pPr>
-        <w:pStyle w:val="ListParagraph"/>
-        <w:numPr>
-          <w:ilvl w:val="0"/>
-          <w:numId w:val="2"/>
-        </w:numPr>
-        <w:spacing w:after="60" w:line="264"/>
-      </w:pPr>
-      <w:r>
-        <w:rPr>
-          <w:rFonts w:ascii="Calibri" w:cs="Calibri" w:eastAsia="Calibri" w:hAnsi="Calibri"/>
-          <w:sz w:val="22"/>
-          <w:szCs w:val="22"/>
-        </w:rPr>
-        <w:t xml:space="preserve">Redémarrer en mode bootloader/fastboot et connecter l'appareil ; vérifier la détection avec la commande de liste des périphériques.</w:t>
-      </w:r>
-    </w:p>
-    <w:p>
-      <w:pPr>
-        <w:pStyle w:val="ListParagraph"/>
-        <w:numPr>
-          <w:ilvl w:val="0"/>
-          <w:numId w:val="2"/>
-        </w:numPr>
-        <w:spacing w:after="60" w:line="264"/>
-      </w:pPr>
-      <w:r>
-        <w:rPr>
-          <w:rFonts w:ascii="Calibri" w:cs="Calibri" w:eastAsia="Calibri" w:hAnsi="Calibri"/>
-          <w:sz w:val="22"/>
-          <w:szCs w:val="22"/>
-        </w:rPr>
-        <w:t xml:space="preserve">Utiliser les images d'usine officielles du constructeur et le script de flash fourni, ou flasher les partitions une à une.</w:t>
-      </w:r>
-    </w:p>
-    <w:p>
-      <w:pPr>
-        <w:pStyle w:val="ListParagraph"/>
-        <w:numPr>
-          <w:ilvl w:val="0"/>
-          <w:numId w:val="2"/>
-        </w:numPr>
-        <w:spacing w:after="60" w:line="264"/>
-      </w:pPr>
-      <w:r>
-        <w:rPr>
-          <w:rFonts w:ascii="Calibri" w:cs="Calibri" w:eastAsia="Calibri" w:hAnsi="Calibri"/>
-          <w:sz w:val="22"/>
-          <w:szCs w:val="22"/>
-        </w:rPr>
-        <w:t xml:space="preserve">Ne pas interrompre le processus ; redémarrer et vérifier.</w:t>
-      </w:r>
-    </w:p>
-    <w:p>
-      <w:pPr>
-        <w:spacing w:after="80"/>
-      </w:pPr>
-    </w:p>
-    <w:p>
-      <w:pPr>
-        <w:pStyle w:val="Heading2"/>
-        <w:spacing w:after="100" w:before="220"/>
-      </w:pPr>
-      <w:r>
-        <w:rPr>
-          <w:rFonts w:ascii="Calibri" w:cs="Calibri" w:eastAsia="Calibri" w:hAnsi="Calibri"/>
-          <w:b/>
-          <w:bCs/>
-          <w:color w:val="2E5E8C"/>
-          <w:sz w:val="26"/>
-          <w:szCs w:val="26"/>
-        </w:rPr>
-        <w:t xml:space="preserve">9. MediaTek (SP Flash Tool) et Qualcomm (EDL)</w:t>
-      </w:r>
-    </w:p>
-    <w:p>
-      <w:pPr>
-        <w:pStyle w:val="ListParagraph"/>
-        <w:numPr>
-          <w:ilvl w:val="0"/>
-          <w:numId w:val="1"/>
-        </w:numPr>
-        <w:spacing w:after="60" w:line="264"/>
-      </w:pPr>
-      <w:r>
-        <w:rPr>
-          <w:rFonts w:ascii="Calibri" w:cs="Calibri" w:eastAsia="Calibri" w:hAnsi="Calibri"/>
-          <w:sz w:val="22"/>
-          <w:szCs w:val="22"/>
-        </w:rPr>
-        <w:t xml:space="preserve">MediaTek : on charge un fichier « scatter » (qui décrit les partitions) dans SP Flash Tool, on sélectionne les partitions à écrire, puis on connecte l'appareil éteint pour lancer le flash.</w:t>
-      </w:r>
-    </w:p>
-    <w:p>
-      <w:pPr>
-        <w:pStyle w:val="ListParagraph"/>
-        <w:numPr>
-          <w:ilvl w:val="0"/>
-          <w:numId w:val="1"/>
-        </w:numPr>
-        <w:spacing w:after="60" w:line="264"/>
-      </w:pPr>
-      <w:r>
-        <w:rPr>
-          <w:rFonts w:ascii="Calibri" w:cs="Calibri" w:eastAsia="Calibri" w:hAnsi="Calibri"/>
-          <w:sz w:val="22"/>
-          <w:szCs w:val="22"/>
-        </w:rPr>
-        <w:t xml:space="preserve">Qualcomm EDL (« 9008 ») : mode d'urgence de bas niveau, utilisé quand l'appareil ne démarre plus ; il nécessite les bons pilotes et un fichier de programmation (firehose). Réservé aux cas avancés.</w:t>
-      </w:r>
-    </w:p>
-    <w:p>
-      <w:pPr>
-        <w:pStyle w:val="ListParagraph"/>
-        <w:numPr>
-          <w:ilvl w:val="0"/>
-          <w:numId w:val="1"/>
-        </w:numPr>
-        <w:spacing w:after="60" w:line="264"/>
-      </w:pPr>
-      <w:r>
-        <w:rPr>
-          <w:rFonts w:ascii="Calibri" w:cs="Calibri" w:eastAsia="Calibri" w:hAnsi="Calibri"/>
-          <w:sz w:val="22"/>
-          <w:szCs w:val="22"/>
-        </w:rPr>
-        <w:t xml:space="preserve">Ces méthodes sont puissantes mais risquées : un mauvais scatter/firmware peut briquer l'appareil. À réserver quand on maîtrise, sur des firmwares officiels.</w:t>
-      </w:r>
-    </w:p>
-    <w:p>
-      <w:pPr>
-        <w:spacing w:after="80"/>
-      </w:pPr>
-    </w:p>
-    <w:tbl>
-      <w:tblPr>
-        <w:tblW w:type="pct" w:w="100%"/>
-        <w:tblBorders>
-          <w:top w:val="none" w:color="FFFFFF" w:sz="0"/>
-          <w:left w:val="none" w:color="FFFFFF" w:sz="0"/>
-          <w:bottom w:val="none" w:color="FFFFFF" w:sz="0"/>
-          <w:right w:val="none" w:color="FFFFFF" w:sz="0"/>
-          <w:insideH w:val="none" w:color="FFFFFF" w:sz="0"/>
-          <w:insideV w:val="none" w:color="FFFFFF" w:sz="0"/>
-        </w:tblBorders>
-      </w:tblPr>
-      <w:tblGrid>
-        <w:gridCol w:w="200"/>
-        <w:gridCol w:w="9160"/>
-      </w:tblGrid>
-      <w:tr>
-        <w:tc>
-          <w:tcPr>
-            <w:tcW w:type="dxa" w:w="200"/>
-            <w:shd w:fill="C0392B" w:color="auto" w:val="clear"/>
-          </w:tcPr>
-          <w:p>
-            <w:r>
-              <w:rPr>
-                <w:rFonts w:ascii="Calibri" w:cs="Calibri" w:eastAsia="Calibri" w:hAnsi="Calibri"/>
-              </w:rPr>
-              <w:t xml:space="preserve"> </w:t>
-            </w:r>
-          </w:p>
-        </w:tc>
-        <w:tc>
-          <w:tcPr>
-            <w:tcW w:type="dxa" w:w="9160"/>
-            <w:shd w:fill="FDECEA" w:color="auto" w:val="clear"/>
-            <w:tcMar>
-              <w:top w:type="dxa" w:w="120"/>
-              <w:left w:type="dxa" w:w="160"/>
-              <w:bottom w:type="dxa" w:w="120"/>
-              <w:right w:type="dxa" w:w="160"/>
-            </w:tcMar>
-          </w:tcPr>
-          <w:p>
-            <w:pPr>
-              <w:spacing w:after="40"/>
-            </w:pPr>
-            <w:r>
-              <w:rPr>
-                <w:rFonts w:ascii="Calibri" w:cs="Calibri" w:eastAsia="Calibri" w:hAnsi="Calibri"/>
-                <w:b/>
-                <w:bCs/>
-                <w:color w:val="C0392B"/>
-                <w:sz w:val="21"/>
-                <w:szCs w:val="21"/>
-              </w:rPr>
-              <w:t xml:space="preserve">Attention IMEI / baseband</w:t>
-            </w:r>
-          </w:p>
-          <w:p>
-            <w:r>
-              <w:rPr>
-                <w:rFonts w:ascii="Calibri" w:cs="Calibri" w:eastAsia="Calibri" w:hAnsi="Calibri"/>
-                <w:color w:val="222222"/>
-                <w:sz w:val="21"/>
-                <w:szCs w:val="21"/>
-              </w:rPr>
-              <w:t xml:space="preserve">Ne cherchez jamais à « régénérer » ou modifier un IMEI. Après un flash, si le réseau ne fonctionne plus, la solution légale est de reflasher le bon firmware/modem officiel — jamais d'écrire un IMEI. La modification d'IMEI est illégale.</w:t>
-            </w:r>
-          </w:p>
-        </w:tc>
-      </w:tr>
-    </w:tbl>
-    <w:p>
-      <w:pPr>
-        <w:spacing w:after="80"/>
-      </w:pPr>
-    </w:p>
-    <w:p>
-      <w:r>
-        <w:br w:type="page"/>
-      </w:r>
-    </w:p>
-    <w:p>
-      <w:r>
-        <w:br w:type="page"/>
-      </w:r>
-    </w:p>
-    <w:p>
-      <w:pPr>
-        <w:pStyle w:val="Heading1"/>
-        <w:spacing w:after="0" w:before="0"/>
-      </w:pPr>
-      <w:r>
-        <w:rPr>
-          <w:rFonts w:ascii="Calibri" w:cs="Calibri" w:eastAsia="Calibri" w:hAnsi="Calibri"/>
-          <w:color w:val="FFFFFF"/>
-          <w:sz w:val="2"/>
-          <w:szCs w:val="2"/>
-        </w:rPr>
-        <w:t xml:space="preserve">Partie 4 — Flashage / restauration iPhone &amp; iPad</w:t>
-      </w:r>
-    </w:p>
-    <w:tbl>
-      <w:tblPr>
-        <w:tblW w:type="pct" w:w="100%"/>
-        <w:tblBorders>
-          <w:top w:val="none" w:color="FFFFFF" w:sz="0"/>
-          <w:left w:val="none" w:color="FFFFFF" w:sz="0"/>
-          <w:bottom w:val="none" w:color="FFFFFF" w:sz="0"/>
-          <w:right w:val="none" w:color="FFFFFF" w:sz="0"/>
-          <w:insideH w:val="none" w:color="FFFFFF" w:sz="0"/>
-          <w:insideV w:val="none" w:color="FFFFFF" w:sz="0"/>
-        </w:tblBorders>
-      </w:tblPr>
-      <w:tblGrid>
-        <w:gridCol w:w="9360"/>
-      </w:tblGrid>
-      <w:tr>
-        <w:tc>
-          <w:tcPr>
-            <w:tcW w:type="dxa" w:w="9360"/>
-            <w:shd w:fill="1F3A5F" w:color="auto" w:val="clear"/>
-            <w:tcMar>
-              <w:top w:type="dxa" w:w="300"/>
-              <w:left w:type="dxa" w:w="320"/>
-              <w:bottom w:type="dxa" w:w="320"/>
-              <w:right w:type="dxa" w:w="320"/>
-            </w:tcMar>
-          </w:tcPr>
-          <w:p>
-            <w:pPr>
-              <w:spacing w:after="40"/>
-            </w:pPr>
-            <w:r>
-              <w:rPr>
-                <w:rFonts w:ascii="Calibri" w:cs="Calibri" w:eastAsia="Calibri" w:hAnsi="Calibri"/>
-                <w:b/>
-                <w:bCs/>
-                <w:color w:val="9FC4E6"/>
-                <w:spacing w:val="60"/>
-                <w:sz w:val="20"/>
-                <w:szCs w:val="20"/>
-              </w:rPr>
-              <w:t xml:space="preserve">PARTIE 4</w:t>
-            </w:r>
-          </w:p>
-          <w:p>
-            <w:r>
-              <w:rPr>
-                <w:rFonts w:ascii="Calibri" w:cs="Calibri" w:eastAsia="Calibri" w:hAnsi="Calibri"/>
-                <w:b/>
-                <w:bCs/>
-                <w:color w:val="FFFFFF"/>
-                <w:sz w:val="40"/>
-                <w:szCs w:val="40"/>
-              </w:rPr>
-              <w:t xml:space="preserve">Flashage / restauration iPhone &amp; iPad</w:t>
-            </w:r>
-          </w:p>
-        </w:tc>
-      </w:tr>
-    </w:tbl>
-    <w:p>
-      <w:pPr>
-        <w:spacing w:after="80"/>
-      </w:pPr>
-    </w:p>
-    <w:p>
-      <w:pPr>
-        <w:spacing w:after="120" w:line="276"/>
-        <w:jc w:val="both"/>
-      </w:pPr>
-      <w:r>
-        <w:rPr>
-          <w:rFonts w:ascii="Calibri" w:cs="Calibri" w:eastAsia="Calibri" w:hAnsi="Calibri"/>
-          <w:sz w:val="22"/>
-          <w:szCs w:val="22"/>
-        </w:rPr>
-        <w:t xml:space="preserve">Chez Apple, tout passe par une restauration officielle avec un fichier IPSW, via Finder (macOS récent) ou iTunes (Windows/macOS ancien). Deux modes existent : Recovery et DFU.</w:t>
-      </w:r>
-    </w:p>
-    <w:p>
-      <w:pPr>
-        <w:pStyle w:val="Heading2"/>
-        <w:spacing w:after="100" w:before="220"/>
-      </w:pPr>
-      <w:r>
-        <w:rPr>
-          <w:rFonts w:ascii="Calibri" w:cs="Calibri" w:eastAsia="Calibri" w:hAnsi="Calibri"/>
-          <w:b/>
-          <w:bCs/>
-          <w:color w:val="2E5E8C"/>
-          <w:sz w:val="26"/>
-          <w:szCs w:val="26"/>
-        </w:rPr>
-        <w:t xml:space="preserve">10. Modes Recovery et DFU</w:t>
-      </w:r>
-    </w:p>
-    <w:p>
-      <w:pPr>
-        <w:pStyle w:val="ListParagraph"/>
-        <w:numPr>
-          <w:ilvl w:val="0"/>
-          <w:numId w:val="1"/>
-        </w:numPr>
-        <w:spacing w:after="60" w:line="264"/>
-      </w:pPr>
-      <w:r>
-        <w:rPr>
-          <w:rFonts w:ascii="Calibri" w:cs="Calibri" w:eastAsia="Calibri" w:hAnsi="Calibri"/>
-          <w:sz w:val="22"/>
-          <w:szCs w:val="22"/>
-        </w:rPr>
-        <w:t xml:space="preserve">Mode Recovery (récupération) : l'écran affiche une invite de connexion à l'ordinateur. Suffisant pour la plupart des restaurations.</w:t>
-      </w:r>
-    </w:p>
-    <w:p>
-      <w:pPr>
-        <w:pStyle w:val="ListParagraph"/>
-        <w:numPr>
-          <w:ilvl w:val="0"/>
-          <w:numId w:val="1"/>
-        </w:numPr>
-        <w:spacing w:after="60" w:line="264"/>
-      </w:pPr>
-      <w:r>
-        <w:rPr>
-          <w:rFonts w:ascii="Calibri" w:cs="Calibri" w:eastAsia="Calibri" w:hAnsi="Calibri"/>
-          <w:sz w:val="22"/>
-          <w:szCs w:val="22"/>
-        </w:rPr>
-        <w:t xml:space="preserve">Mode DFU (Device Firmware Update) : plus bas niveau, écran totalement noir ; utile quand la Recovery ne suffit pas. On l'active par une séquence précise de boutons propre à chaque modèle.</w:t>
-      </w:r>
-    </w:p>
-    <w:p>
-      <w:pPr>
-        <w:pStyle w:val="ListParagraph"/>
-        <w:numPr>
-          <w:ilvl w:val="0"/>
-          <w:numId w:val="1"/>
-        </w:numPr>
-        <w:spacing w:after="60" w:line="264"/>
-      </w:pPr>
-      <w:r>
-        <w:rPr>
-          <w:rFonts w:ascii="Calibri" w:cs="Calibri" w:eastAsia="Calibri" w:hAnsi="Calibri"/>
-          <w:sz w:val="22"/>
-          <w:szCs w:val="22"/>
-        </w:rPr>
-        <w:t xml:space="preserve">Dans les deux cas, on branche l'appareil, on ouvre Finder/iTunes, et on choisit « Restaurer » (avec un IPSW compatible).</w:t>
-      </w:r>
-    </w:p>
-    <w:p>
-      <w:pPr>
-        <w:spacing w:after="80"/>
-      </w:pPr>
-    </w:p>
-    <w:p>
-      <w:pPr>
-        <w:pStyle w:val="Heading2"/>
-        <w:spacing w:after="100" w:before="220"/>
-      </w:pPr>
-      <w:r>
-        <w:rPr>
-          <w:rFonts w:ascii="Calibri" w:cs="Calibri" w:eastAsia="Calibri" w:hAnsi="Calibri"/>
-          <w:b/>
-          <w:bCs/>
-          <w:color w:val="2E5E8C"/>
-          <w:sz w:val="26"/>
-          <w:szCs w:val="26"/>
-        </w:rPr>
-        <w:t xml:space="preserve">11. Restaurer proprement</w:t>
-      </w:r>
-    </w:p>
-    <w:p>
-      <w:pPr>
-        <w:pStyle w:val="ListParagraph"/>
-        <w:numPr>
-          <w:ilvl w:val="0"/>
-          <w:numId w:val="2"/>
-        </w:numPr>
-        <w:spacing w:after="60" w:line="264"/>
-      </w:pPr>
-      <w:r>
-        <w:rPr>
-          <w:rFonts w:ascii="Calibri" w:cs="Calibri" w:eastAsia="Calibri" w:hAnsi="Calibri"/>
-          <w:sz w:val="22"/>
-          <w:szCs w:val="22"/>
-        </w:rPr>
-        <w:t xml:space="preserve">Sauvegarder si l'appareil est encore accessible.</w:t>
-      </w:r>
-    </w:p>
-    <w:p>
-      <w:pPr>
-        <w:pStyle w:val="ListParagraph"/>
-        <w:numPr>
-          <w:ilvl w:val="0"/>
-          <w:numId w:val="2"/>
-        </w:numPr>
-        <w:spacing w:after="60" w:line="264"/>
-      </w:pPr>
-      <w:r>
-        <w:rPr>
-          <w:rFonts w:ascii="Calibri" w:cs="Calibri" w:eastAsia="Calibri" w:hAnsi="Calibri"/>
-          <w:sz w:val="22"/>
-          <w:szCs w:val="22"/>
-        </w:rPr>
-        <w:t xml:space="preserve">Brancher l'appareil et le mettre en mode Recovery (ou DFU si nécessaire).</w:t>
-      </w:r>
-    </w:p>
-    <w:p>
-      <w:pPr>
-        <w:pStyle w:val="ListParagraph"/>
-        <w:numPr>
-          <w:ilvl w:val="0"/>
-          <w:numId w:val="2"/>
-        </w:numPr>
-        <w:spacing w:after="60" w:line="264"/>
-      </w:pPr>
-      <w:r>
-        <w:rPr>
-          <w:rFonts w:ascii="Calibri" w:cs="Calibri" w:eastAsia="Calibri" w:hAnsi="Calibri"/>
-          <w:sz w:val="22"/>
-          <w:szCs w:val="22"/>
-        </w:rPr>
-        <w:t xml:space="preserve">Dans Finder/iTunes, choisir « Restaurer l'iPhone » ; l'outil télécharge/installe la version compatible signée par Apple.</w:t>
-      </w:r>
-    </w:p>
-    <w:p>
-      <w:pPr>
-        <w:pStyle w:val="ListParagraph"/>
-        <w:numPr>
-          <w:ilvl w:val="0"/>
-          <w:numId w:val="2"/>
-        </w:numPr>
-        <w:spacing w:after="60" w:line="264"/>
-      </w:pPr>
-      <w:r>
-        <w:rPr>
-          <w:rFonts w:ascii="Calibri" w:cs="Calibri" w:eastAsia="Calibri" w:hAnsi="Calibri"/>
-          <w:sz w:val="22"/>
-          <w:szCs w:val="22"/>
-        </w:rPr>
-        <w:t xml:space="preserve">Laisser l'opération se terminer sans débrancher ; l'appareil redémarre « comme neuf ».</w:t>
-      </w:r>
-    </w:p>
-    <w:p>
-      <w:pPr>
-        <w:spacing w:after="80"/>
-      </w:pPr>
-    </w:p>
-    <w:tbl>
-      <w:tblPr>
-        <w:tblW w:type="pct" w:w="100%"/>
-        <w:tblBorders>
-          <w:top w:val="none" w:color="FFFFFF" w:sz="0"/>
-          <w:left w:val="none" w:color="FFFFFF" w:sz="0"/>
-          <w:bottom w:val="none" w:color="FFFFFF" w:sz="0"/>
-          <w:right w:val="none" w:color="FFFFFF" w:sz="0"/>
-          <w:insideH w:val="none" w:color="FFFFFF" w:sz="0"/>
-          <w:insideV w:val="none" w:color="FFFFFF" w:sz="0"/>
-        </w:tblBorders>
-      </w:tblPr>
-      <w:tblGrid>
-        <w:gridCol w:w="200"/>
-        <w:gridCol w:w="9160"/>
-      </w:tblGrid>
-      <w:tr>
-        <w:tc>
-          <w:tcPr>
-            <w:tcW w:type="dxa" w:w="200"/>
-            <w:shd w:fill="C0392B" w:color="auto" w:val="clear"/>
-          </w:tcPr>
-          <w:p>
-            <w:r>
-              <w:rPr>
-                <w:rFonts w:ascii="Calibri" w:cs="Calibri" w:eastAsia="Calibri" w:hAnsi="Calibri"/>
-              </w:rPr>
-              <w:t xml:space="preserve"> </w:t>
-            </w:r>
-          </w:p>
-        </w:tc>
-        <w:tc>
-          <w:tcPr>
-            <w:tcW w:type="dxa" w:w="9160"/>
-            <w:shd w:fill="FDECEA" w:color="auto" w:val="clear"/>
-            <w:tcMar>
-              <w:top w:type="dxa" w:w="120"/>
-              <w:left w:type="dxa" w:w="160"/>
-              <w:bottom w:type="dxa" w:w="120"/>
-              <w:right w:type="dxa" w:w="160"/>
-            </w:tcMar>
-          </w:tcPr>
-          <w:p>
-            <w:pPr>
-              <w:spacing w:after="40"/>
-            </w:pPr>
-            <w:r>
-              <w:rPr>
-                <w:rFonts w:ascii="Calibri" w:cs="Calibri" w:eastAsia="Calibri" w:hAnsi="Calibri"/>
-                <w:b/>
-                <w:bCs/>
-                <w:color w:val="C0392B"/>
-                <w:sz w:val="21"/>
-                <w:szCs w:val="21"/>
-              </w:rPr>
-              <w:t xml:space="preserve">Verrouillage d'activation (iCloud)</w:t>
-            </w:r>
-          </w:p>
-          <w:p>
-            <w:r>
-              <w:rPr>
-                <w:rFonts w:ascii="Calibri" w:cs="Calibri" w:eastAsia="Calibri" w:hAnsi="Calibri"/>
-                <w:color w:val="222222"/>
-                <w:sz w:val="21"/>
-                <w:szCs w:val="21"/>
-              </w:rPr>
-              <w:t xml:space="preserve">Après restauration, l'iPhone redemandera l'identifiant Apple d'origine si le « Localiser » (verrouillage d'activation) était actif. C'est une protection antivol : elle ne se contourne PAS. Le propriétaire légitime doit se connecter avec son compte, ou faire retirer le verrou par Apple sur preuve d'achat. Un iPhone verrouillé sans preuve de propriété ne doit pas être accepté.</w:t>
-            </w:r>
-          </w:p>
-        </w:tc>
-      </w:tr>
-    </w:tbl>
-    <w:p>
-      <w:pPr>
-        <w:spacing w:after="80"/>
-      </w:pPr>
-    </w:p>
-    <w:p>
-      <w:r>
-        <w:br w:type="page"/>
-      </w:r>
-    </w:p>
-    <w:p>
-      <w:r>
-        <w:br w:type="page"/>
-      </w:r>
-    </w:p>
-    <w:p>
-      <w:pPr>
-        <w:pStyle w:val="Heading1"/>
-        <w:spacing w:after="0" w:before="0"/>
-      </w:pPr>
-      <w:r>
-        <w:rPr>
-          <w:rFonts w:ascii="Calibri" w:cs="Calibri" w:eastAsia="Calibri" w:hAnsi="Calibri"/>
-          <w:color w:val="FFFFFF"/>
-          <w:sz w:val="2"/>
-          <w:szCs w:val="2"/>
-        </w:rPr>
-        <w:t xml:space="preserve">Partie 5 — Déblocage réseau (désimlockage) légal</w:t>
-      </w:r>
-    </w:p>
-    <w:tbl>
-      <w:tblPr>
-        <w:tblW w:type="pct" w:w="100%"/>
-        <w:tblBorders>
-          <w:top w:val="none" w:color="FFFFFF" w:sz="0"/>
-          <w:left w:val="none" w:color="FFFFFF" w:sz="0"/>
-          <w:bottom w:val="none" w:color="FFFFFF" w:sz="0"/>
-          <w:right w:val="none" w:color="FFFFFF" w:sz="0"/>
-          <w:insideH w:val="none" w:color="FFFFFF" w:sz="0"/>
-          <w:insideV w:val="none" w:color="FFFFFF" w:sz="0"/>
-        </w:tblBorders>
-      </w:tblPr>
-      <w:tblGrid>
-        <w:gridCol w:w="9360"/>
-      </w:tblGrid>
-      <w:tr>
-        <w:tc>
-          <w:tcPr>
-            <w:tcW w:type="dxa" w:w="9360"/>
-            <w:shd w:fill="1F3A5F" w:color="auto" w:val="clear"/>
-            <w:tcMar>
-              <w:top w:type="dxa" w:w="300"/>
-              <w:left w:type="dxa" w:w="320"/>
-              <w:bottom w:type="dxa" w:w="320"/>
-              <w:right w:type="dxa" w:w="320"/>
-            </w:tcMar>
-          </w:tcPr>
-          <w:p>
-            <w:pPr>
-              <w:spacing w:after="40"/>
-            </w:pPr>
-            <w:r>
-              <w:rPr>
-                <w:rFonts w:ascii="Calibri" w:cs="Calibri" w:eastAsia="Calibri" w:hAnsi="Calibri"/>
-                <w:b/>
-                <w:bCs/>
-                <w:color w:val="9FC4E6"/>
-                <w:spacing w:val="60"/>
-                <w:sz w:val="20"/>
-                <w:szCs w:val="20"/>
-              </w:rPr>
-              <w:t xml:space="preserve">PARTIE 5</w:t>
-            </w:r>
-          </w:p>
-          <w:p>
-            <w:r>
-              <w:rPr>
-                <w:rFonts w:ascii="Calibri" w:cs="Calibri" w:eastAsia="Calibri" w:hAnsi="Calibri"/>
-                <w:b/>
-                <w:bCs/>
-                <w:color w:val="FFFFFF"/>
-                <w:sz w:val="40"/>
-                <w:szCs w:val="40"/>
-              </w:rPr>
-              <w:t xml:space="preserve">Déblocage réseau (désimlockage) légal</w:t>
-            </w:r>
-          </w:p>
-        </w:tc>
-      </w:tr>
-    </w:tbl>
-    <w:p>
-      <w:pPr>
-        <w:spacing w:after="80"/>
-      </w:pPr>
-    </w:p>
-    <w:p>
-      <w:pPr>
-        <w:spacing w:after="120" w:line="276"/>
-        <w:jc w:val="both"/>
-      </w:pPr>
-      <w:r>
-        <w:rPr>
-          <w:rFonts w:ascii="Calibri" w:cs="Calibri" w:eastAsia="Calibri" w:hAnsi="Calibri"/>
-          <w:sz w:val="22"/>
-          <w:szCs w:val="22"/>
-        </w:rPr>
-        <w:t xml:space="preserve">Le déblocage réseau permet à un téléphone « bloqué » sur un opérateur d'accepter les cartes SIM d'autres opérateurs. C'est un service parfaitement légal — à condition de le faire par les voies autorisées et sur un appareil dont la propriété est établie.</w:t>
-      </w:r>
-    </w:p>
     <w:p>
       <w:pPr>
         <w:spacing w:after="40" w:before="120"/>
@@ -2981,7 +2202,7 @@
       <w:r>
         <w:drawing>
           <wp:inline distT="0" distB="0" distL="0" distR="0">
-            <wp:extent cx="4476750" cy="1885950"/>
+            <wp:extent cx="4476750" cy="4276725"/>
             <wp:effectExtent t="0" r="0" b="0" l="0"/>
             <wp:docPr id="1" name="" descr="" title=""/>
             <wp:cNvGraphicFramePr>
@@ -3006,7 +2227,7 @@
                   <pic:spPr bwMode="auto">
                     <a:xfrm>
                       <a:off x="0" y="0"/>
-                      <a:ext cx="4476750" cy="1885950"/>
+                      <a:ext cx="4476750" cy="4276725"/>
                     </a:xfrm>
                     <a:prstGeom prst="rect">
                       <a:avLst/>
@@ -3033,196 +2254,8 @@
           <w:sz w:val="17"/>
           <w:szCs w:val="17"/>
         </w:rPr>
-        <w:t xml:space="preserve">Déblocage réseau : les méthodes autorisées et celles à refuser absolument.</w:t>
-      </w:r>
-    </w:p>
-    <w:p>
-      <w:pPr>
-        <w:pStyle w:val="Heading2"/>
-        <w:spacing w:after="100" w:before="220"/>
-      </w:pPr>
-      <w:r>
-        <w:rPr>
-          <w:rFonts w:ascii="Calibri" w:cs="Calibri" w:eastAsia="Calibri" w:hAnsi="Calibri"/>
-          <w:b/>
-          <w:bCs/>
-          <w:color w:val="2E5E8C"/>
-          <w:sz w:val="26"/>
-          <w:szCs w:val="26"/>
-        </w:rPr>
-        <w:t xml:space="preserve">12. Les méthodes légales</w:t>
-      </w:r>
-    </w:p>
-    <w:p>
-      <w:pPr>
-        <w:pStyle w:val="ListParagraph"/>
-        <w:numPr>
-          <w:ilvl w:val="0"/>
-          <w:numId w:val="1"/>
-        </w:numPr>
-        <w:spacing w:after="60" w:line="264"/>
-      </w:pPr>
-      <w:r>
-        <w:rPr>
-          <w:rFonts w:ascii="Calibri" w:cs="Calibri" w:eastAsia="Calibri" w:hAnsi="Calibri"/>
-          <w:sz w:val="22"/>
-          <w:szCs w:val="22"/>
-        </w:rPr>
-        <w:t xml:space="preserve">Code de déblocage de l'opérateur : le propriétaire peut, sous conditions (téléphone payé, délai écoulé), demander gratuitement le déverrouillage à son opérateur. C'est la voie reine.</w:t>
-      </w:r>
-    </w:p>
-    <w:p>
-      <w:pPr>
-        <w:pStyle w:val="ListParagraph"/>
-        <w:numPr>
-          <w:ilvl w:val="0"/>
-          <w:numId w:val="1"/>
-        </w:numPr>
-        <w:spacing w:after="60" w:line="264"/>
-      </w:pPr>
-      <w:r>
-        <w:rPr>
-          <w:rFonts w:ascii="Calibri" w:cs="Calibri" w:eastAsia="Calibri" w:hAnsi="Calibri"/>
-          <w:sz w:val="22"/>
-          <w:szCs w:val="22"/>
-        </w:rPr>
-        <w:t xml:space="preserve">Service de désimlockage par IMEI : des services officiels débloquent « à distance » en enregistrant l'IMEI comme déverrouillé dans les bases constructeur/opérateur. Choisissez des prestataires sérieux et légaux.</w:t>
-      </w:r>
-    </w:p>
-    <w:p>
-      <w:pPr>
-        <w:pStyle w:val="ListParagraph"/>
-        <w:numPr>
-          <w:ilvl w:val="0"/>
-          <w:numId w:val="1"/>
-        </w:numPr>
-        <w:spacing w:after="60" w:line="264"/>
-      </w:pPr>
-      <w:r>
-        <w:rPr>
-          <w:rFonts w:ascii="Calibri" w:cs="Calibri" w:eastAsia="Calibri" w:hAnsi="Calibri"/>
-          <w:sz w:val="22"/>
-          <w:szCs w:val="22"/>
-        </w:rPr>
-        <w:t xml:space="preserve">Passage à l'eSIM / opérateur compatible selon les cas.</w:t>
-      </w:r>
-    </w:p>
-    <w:p>
-      <w:pPr>
-        <w:pStyle w:val="ListParagraph"/>
-        <w:numPr>
-          <w:ilvl w:val="0"/>
-          <w:numId w:val="1"/>
-        </w:numPr>
-        <w:spacing w:after="60" w:line="264"/>
-      </w:pPr>
-      <w:r>
-        <w:rPr>
-          <w:rFonts w:ascii="Calibri" w:cs="Calibri" w:eastAsia="Calibri" w:hAnsi="Calibri"/>
-          <w:sz w:val="22"/>
-          <w:szCs w:val="22"/>
-        </w:rPr>
-        <w:t xml:space="preserve">Dans tous les cas : l'appareil ne doit pas être signalé perdu/volé, et la propriété doit être prouvée.</w:t>
-      </w:r>
-    </w:p>
-    <w:p>
-      <w:pPr>
-        <w:spacing w:after="80"/>
-      </w:pPr>
-    </w:p>
-    <w:p>
-      <w:pPr>
-        <w:pStyle w:val="Heading2"/>
-        <w:spacing w:after="100" w:before="220"/>
-      </w:pPr>
-      <w:r>
-        <w:rPr>
-          <w:rFonts w:ascii="Calibri" w:cs="Calibri" w:eastAsia="Calibri" w:hAnsi="Calibri"/>
-          <w:b/>
-          <w:bCs/>
-          <w:color w:val="2E5E8C"/>
-          <w:sz w:val="26"/>
-          <w:szCs w:val="26"/>
-        </w:rPr>
-        <w:t xml:space="preserve">13. Ce qu'il ne faut jamais faire</w:t>
-      </w:r>
-    </w:p>
-    <w:p>
-      <w:pPr>
-        <w:pStyle w:val="ListParagraph"/>
-        <w:numPr>
-          <w:ilvl w:val="0"/>
-          <w:numId w:val="1"/>
-        </w:numPr>
-        <w:spacing w:after="60" w:line="264"/>
-      </w:pPr>
-      <w:r>
-        <w:rPr>
-          <w:rFonts w:ascii="Calibri" w:cs="Calibri" w:eastAsia="Calibri" w:hAnsi="Calibri"/>
-          <w:sz w:val="22"/>
-          <w:szCs w:val="22"/>
-        </w:rPr>
-        <w:t xml:space="preserve">Débloquer un appareil signalé volé ou perdu (listes noires IMEI) : illégal et traçable.</w:t>
-      </w:r>
-    </w:p>
-    <w:p>
-      <w:pPr>
-        <w:pStyle w:val="ListParagraph"/>
-        <w:numPr>
-          <w:ilvl w:val="0"/>
-          <w:numId w:val="1"/>
-        </w:numPr>
-        <w:spacing w:after="60" w:line="264"/>
-      </w:pPr>
-      <w:r>
-        <w:rPr>
-          <w:rFonts w:ascii="Calibri" w:cs="Calibri" w:eastAsia="Calibri" w:hAnsi="Calibri"/>
-          <w:sz w:val="22"/>
-          <w:szCs w:val="22"/>
-        </w:rPr>
-        <w:t xml:space="preserve">Contourner un verrou de compte (iCloud/FRP) sous couvert de « déblocage » : ce n'est pas du désimlockage, c'est du contournement d'antivol.</w:t>
-      </w:r>
-    </w:p>
-    <w:p>
-      <w:pPr>
-        <w:pStyle w:val="ListParagraph"/>
-        <w:numPr>
-          <w:ilvl w:val="0"/>
-          <w:numId w:val="1"/>
-        </w:numPr>
-        <w:spacing w:after="60" w:line="264"/>
-      </w:pPr>
-      <w:r>
-        <w:rPr>
-          <w:rFonts w:ascii="Calibri" w:cs="Calibri" w:eastAsia="Calibri" w:hAnsi="Calibri"/>
-          <w:sz w:val="22"/>
-          <w:szCs w:val="22"/>
-        </w:rPr>
-        <w:t xml:space="preserve">Modifier l'IMEI pour « sortir » un appareil d'une liste noire : illégal.</w:t>
-      </w:r>
-    </w:p>
-    <w:p>
-      <w:pPr>
-        <w:pStyle w:val="ListParagraph"/>
-        <w:numPr>
-          <w:ilvl w:val="0"/>
-          <w:numId w:val="1"/>
-        </w:numPr>
-        <w:spacing w:after="60" w:line="264"/>
-      </w:pPr>
-      <w:r>
-        <w:rPr>
-          <w:rFonts w:ascii="Calibri" w:cs="Calibri" w:eastAsia="Calibri" w:hAnsi="Calibri"/>
-          <w:sz w:val="22"/>
-          <w:szCs w:val="22"/>
-        </w:rPr>
-        <w:t xml:space="preserve">Accepter un appareil dont le client ne peut prouver la propriété.</w:t>
-      </w:r>
-    </w:p>
-    <w:p>
-      <w:pPr>
-        <w:spacing w:after="80"/>
-      </w:pPr>
+        <w:t xml:space="preserve">Les étapes du flashage d'un Samsung via le mode Download et Odin.</w:t>
+      </w:r>
     </w:p>
     <w:tbl>
       <w:tblPr>
@@ -3279,7 +2312,7 @@
                 <w:sz w:val="21"/>
                 <w:szCs w:val="21"/>
               </w:rPr>
-              <w:t xml:space="preserve">La bonne question à poser</w:t>
+              <w:t xml:space="preserve">Compteur de flash et sécurité</w:t>
             </w:r>
           </w:p>
           <w:p>
@@ -3290,7 +2323,7 @@
                 <w:sz w:val="21"/>
                 <w:szCs w:val="21"/>
               </w:rPr>
-              <w:t xml:space="preserve">« Avez-vous une preuve d'achat / la facture ? » Cette simple question filtre l'essentiel des demandes problématiques et protège votre commerce. En cas de doute, refusez poliment.</w:t>
+              <w:t xml:space="preserve">Certains fabricants enregistrent les flashages non officiels (compteur, indicateur de garantie). Un flash de firmware OFFICIEL est sans risque ; un firmware modifié peut affecter la garantie et certaines fonctions de sécurité. Informez le client.</w:t>
             </w:r>
           </w:p>
         </w:tc>
@@ -3300,110 +2333,6 @@
       <w:pPr>
         <w:spacing w:after="80"/>
       </w:pPr>
-    </w:p>
-    <w:p>
-      <w:r>
-        <w:br w:type="page"/>
-      </w:r>
-    </w:p>
-    <w:p>
-      <w:r>
-        <w:br w:type="page"/>
-      </w:r>
-    </w:p>
-    <w:p>
-      <w:pPr>
-        <w:pStyle w:val="Heading1"/>
-        <w:spacing w:after="0" w:before="0"/>
-      </w:pPr>
-      <w:r>
-        <w:rPr>
-          <w:rFonts w:ascii="Calibri" w:cs="Calibri" w:eastAsia="Calibri" w:hAnsi="Calibri"/>
-          <w:color w:val="FFFFFF"/>
-          <w:sz w:val="2"/>
-          <w:szCs w:val="2"/>
-        </w:rPr>
-        <w:t xml:space="preserve">Partie 6 — Bootloader, root et ROM personnalisées (Android)</w:t>
-      </w:r>
-    </w:p>
-    <w:tbl>
-      <w:tblPr>
-        <w:tblW w:type="pct" w:w="100%"/>
-        <w:tblBorders>
-          <w:top w:val="none" w:color="FFFFFF" w:sz="0"/>
-          <w:left w:val="none" w:color="FFFFFF" w:sz="0"/>
-          <w:bottom w:val="none" w:color="FFFFFF" w:sz="0"/>
-          <w:right w:val="none" w:color="FFFFFF" w:sz="0"/>
-          <w:insideH w:val="none" w:color="FFFFFF" w:sz="0"/>
-          <w:insideV w:val="none" w:color="FFFFFF" w:sz="0"/>
-        </w:tblBorders>
-      </w:tblPr>
-      <w:tblGrid>
-        <w:gridCol w:w="9360"/>
-      </w:tblGrid>
-      <w:tr>
-        <w:tc>
-          <w:tcPr>
-            <w:tcW w:type="dxa" w:w="9360"/>
-            <w:shd w:fill="1F3A5F" w:color="auto" w:val="clear"/>
-            <w:tcMar>
-              <w:top w:type="dxa" w:w="300"/>
-              <w:left w:type="dxa" w:w="320"/>
-              <w:bottom w:type="dxa" w:w="320"/>
-              <w:right w:type="dxa" w:w="320"/>
-            </w:tcMar>
-          </w:tcPr>
-          <w:p>
-            <w:pPr>
-              <w:spacing w:after="40"/>
-            </w:pPr>
-            <w:r>
-              <w:rPr>
-                <w:rFonts w:ascii="Calibri" w:cs="Calibri" w:eastAsia="Calibri" w:hAnsi="Calibri"/>
-                <w:b/>
-                <w:bCs/>
-                <w:color w:val="9FC4E6"/>
-                <w:spacing w:val="60"/>
-                <w:sz w:val="20"/>
-                <w:szCs w:val="20"/>
-              </w:rPr>
-              <w:t xml:space="preserve">PARTIE 6</w:t>
-            </w:r>
-          </w:p>
-          <w:p>
-            <w:r>
-              <w:rPr>
-                <w:rFonts w:ascii="Calibri" w:cs="Calibri" w:eastAsia="Calibri" w:hAnsi="Calibri"/>
-                <w:b/>
-                <w:bCs/>
-                <w:color w:val="FFFFFF"/>
-                <w:sz w:val="40"/>
-                <w:szCs w:val="40"/>
-              </w:rPr>
-              <w:t xml:space="preserve">Bootloader, root et ROM personnalisées (Android)</w:t>
-            </w:r>
-          </w:p>
-        </w:tc>
-      </w:tr>
-    </w:tbl>
-    <w:p>
-      <w:pPr>
-        <w:spacing w:after="80"/>
-      </w:pPr>
-    </w:p>
-    <w:p>
-      <w:pPr>
-        <w:spacing w:after="120" w:line="276"/>
-        <w:jc w:val="both"/>
-      </w:pPr>
-      <w:r>
-        <w:rPr>
-          <w:rFonts w:ascii="Calibri" w:cs="Calibri" w:eastAsia="Calibri" w:hAnsi="Calibri"/>
-          <w:sz w:val="22"/>
-          <w:szCs w:val="22"/>
-        </w:rPr>
-        <w:t xml:space="preserve">Déverrouiller le bootloader, « rooter » ou installer une ROM personnalisée sont des opérations que le propriétaire peut légitimement demander sur SON appareil. Elles comportent toutefois des contreparties qu'il faut expliquer clairement.</w:t>
-      </w:r>
     </w:p>
     <w:p>
       <w:pPr>
@@ -3419,266 +2348,85 @@
           <w:sz w:val="26"/>
           <w:szCs w:val="26"/>
         </w:rPr>
-        <w:t xml:space="preserve">14. Ce que ça implique</w:t>
-      </w:r>
-    </w:p>
-    <w:p>
-      <w:pPr>
-        <w:pStyle w:val="ListParagraph"/>
-        <w:numPr>
-          <w:ilvl w:val="0"/>
-          <w:numId w:val="1"/>
-        </w:numPr>
-        <w:spacing w:after="60" w:line="264"/>
-      </w:pPr>
-      <w:r>
-        <w:rPr>
-          <w:rFonts w:ascii="Calibri" w:cs="Calibri" w:eastAsia="Calibri" w:hAnsi="Calibri"/>
-          <w:sz w:val="22"/>
-          <w:szCs w:val="22"/>
-        </w:rPr>
-        <w:t xml:space="preserve">Déverrouillage du bootloader : souvent EFFACE toutes les données (sécurité) et peut annuler la garantie.</w:t>
-      </w:r>
-    </w:p>
-    <w:p>
-      <w:pPr>
-        <w:pStyle w:val="ListParagraph"/>
-        <w:numPr>
-          <w:ilvl w:val="0"/>
-          <w:numId w:val="1"/>
-        </w:numPr>
-        <w:spacing w:after="60" w:line="264"/>
-      </w:pPr>
-      <w:r>
-        <w:rPr>
-          <w:rFonts w:ascii="Calibri" w:cs="Calibri" w:eastAsia="Calibri" w:hAnsi="Calibri"/>
-          <w:sz w:val="22"/>
-          <w:szCs w:val="22"/>
-        </w:rPr>
-        <w:t xml:space="preserve">Root / ROM personnalisée : peut casser certaines fonctions (paiement sans contact, applications bancaires, mises à jour officielles) et réduire la sécurité si mal fait.</w:t>
-      </w:r>
-    </w:p>
-    <w:p>
-      <w:pPr>
-        <w:pStyle w:val="ListParagraph"/>
-        <w:numPr>
-          <w:ilvl w:val="0"/>
-          <w:numId w:val="1"/>
-        </w:numPr>
-        <w:spacing w:after="60" w:line="264"/>
-      </w:pPr>
-      <w:r>
-        <w:rPr>
-          <w:rFonts w:ascii="Calibri" w:cs="Calibri" w:eastAsia="Calibri" w:hAnsi="Calibri"/>
-          <w:sz w:val="22"/>
-          <w:szCs w:val="22"/>
-        </w:rPr>
-        <w:t xml:space="preserve">Réversibilité : reverrouiller/revenir au stock est parfois possible, parfois non selon le modèle.</w:t>
-      </w:r>
-    </w:p>
-    <w:p>
-      <w:pPr>
-        <w:pStyle w:val="ListParagraph"/>
-        <w:numPr>
-          <w:ilvl w:val="0"/>
-          <w:numId w:val="1"/>
-        </w:numPr>
-        <w:spacing w:after="60" w:line="264"/>
-      </w:pPr>
-      <w:r>
-        <w:rPr>
-          <w:rFonts w:ascii="Calibri" w:cs="Calibri" w:eastAsia="Calibri" w:hAnsi="Calibri"/>
-          <w:sz w:val="22"/>
-          <w:szCs w:val="22"/>
-        </w:rPr>
-        <w:t xml:space="preserve">Sur beaucoup d'appareils récents, le déverrouillage OEM est bridé par le constructeur.</w:t>
+        <w:t xml:space="preserve">8. Fastboot (Pixel et nombreux Android)</w:t>
+      </w:r>
+    </w:p>
+    <w:p>
+      <w:pPr>
+        <w:pStyle w:val="ListParagraph"/>
+        <w:numPr>
+          <w:ilvl w:val="0"/>
+          <w:numId w:val="2"/>
+        </w:numPr>
+        <w:spacing w:after="60" w:line="264"/>
+      </w:pPr>
+      <w:r>
+        <w:rPr>
+          <w:rFonts w:ascii="Calibri" w:cs="Calibri" w:eastAsia="Calibri" w:hAnsi="Calibri"/>
+          <w:sz w:val="22"/>
+          <w:szCs w:val="22"/>
+        </w:rPr>
+        <w:t xml:space="preserve">Activer le débogage USB et, si nécessaire et autorisé par le constructeur, le déverrouillage OEM (voir Partie 6 pour les implications).</w:t>
+      </w:r>
+    </w:p>
+    <w:p>
+      <w:pPr>
+        <w:pStyle w:val="ListParagraph"/>
+        <w:numPr>
+          <w:ilvl w:val="0"/>
+          <w:numId w:val="2"/>
+        </w:numPr>
+        <w:spacing w:after="60" w:line="264"/>
+      </w:pPr>
+      <w:r>
+        <w:rPr>
+          <w:rFonts w:ascii="Calibri" w:cs="Calibri" w:eastAsia="Calibri" w:hAnsi="Calibri"/>
+          <w:sz w:val="22"/>
+          <w:szCs w:val="22"/>
+        </w:rPr>
+        <w:t xml:space="preserve">Redémarrer en mode bootloader/fastboot et connecter l'appareil ; vérifier la détection avec la commande de liste des périphériques.</w:t>
+      </w:r>
+    </w:p>
+    <w:p>
+      <w:pPr>
+        <w:pStyle w:val="ListParagraph"/>
+        <w:numPr>
+          <w:ilvl w:val="0"/>
+          <w:numId w:val="2"/>
+        </w:numPr>
+        <w:spacing w:after="60" w:line="264"/>
+      </w:pPr>
+      <w:r>
+        <w:rPr>
+          <w:rFonts w:ascii="Calibri" w:cs="Calibri" w:eastAsia="Calibri" w:hAnsi="Calibri"/>
+          <w:sz w:val="22"/>
+          <w:szCs w:val="22"/>
+        </w:rPr>
+        <w:t xml:space="preserve">Utiliser les images d'usine officielles du constructeur et le script de flash fourni, ou flasher les partitions une à une.</w:t>
+      </w:r>
+    </w:p>
+    <w:p>
+      <w:pPr>
+        <w:pStyle w:val="ListParagraph"/>
+        <w:numPr>
+          <w:ilvl w:val="0"/>
+          <w:numId w:val="2"/>
+        </w:numPr>
+        <w:spacing w:after="60" w:line="264"/>
+      </w:pPr>
+      <w:r>
+        <w:rPr>
+          <w:rFonts w:ascii="Calibri" w:cs="Calibri" w:eastAsia="Calibri" w:hAnsi="Calibri"/>
+          <w:sz w:val="22"/>
+          <w:szCs w:val="22"/>
+        </w:rPr>
+        <w:t xml:space="preserve">Ne pas interrompre le processus ; redémarrer et vérifier.</w:t>
       </w:r>
     </w:p>
     <w:p>
       <w:pPr>
         <w:spacing w:after="80"/>
       </w:pPr>
-    </w:p>
-    <w:tbl>
-      <w:tblPr>
-        <w:tblW w:type="pct" w:w="100%"/>
-        <w:tblBorders>
-          <w:top w:val="none" w:color="FFFFFF" w:sz="0"/>
-          <w:left w:val="none" w:color="FFFFFF" w:sz="0"/>
-          <w:bottom w:val="none" w:color="FFFFFF" w:sz="0"/>
-          <w:right w:val="none" w:color="FFFFFF" w:sz="0"/>
-          <w:insideH w:val="none" w:color="FFFFFF" w:sz="0"/>
-          <w:insideV w:val="none" w:color="FFFFFF" w:sz="0"/>
-        </w:tblBorders>
-      </w:tblPr>
-      <w:tblGrid>
-        <w:gridCol w:w="200"/>
-        <w:gridCol w:w="9160"/>
-      </w:tblGrid>
-      <w:tr>
-        <w:tc>
-          <w:tcPr>
-            <w:tcW w:type="dxa" w:w="200"/>
-            <w:shd w:fill="27AE60" w:color="auto" w:val="clear"/>
-          </w:tcPr>
-          <w:p>
-            <w:r>
-              <w:rPr>
-                <w:rFonts w:ascii="Calibri" w:cs="Calibri" w:eastAsia="Calibri" w:hAnsi="Calibri"/>
-              </w:rPr>
-              <w:t xml:space="preserve"> </w:t>
-            </w:r>
-          </w:p>
-        </w:tc>
-        <w:tc>
-          <w:tcPr>
-            <w:tcW w:type="dxa" w:w="9160"/>
-            <w:shd w:fill="EAF7EE" w:color="auto" w:val="clear"/>
-            <w:tcMar>
-              <w:top w:type="dxa" w:w="120"/>
-              <w:left w:type="dxa" w:w="160"/>
-              <w:bottom w:type="dxa" w:w="120"/>
-              <w:right w:type="dxa" w:w="160"/>
-            </w:tcMar>
-          </w:tcPr>
-          <w:p>
-            <w:pPr>
-              <w:spacing w:after="40"/>
-            </w:pPr>
-            <w:r>
-              <w:rPr>
-                <w:rFonts w:ascii="Calibri" w:cs="Calibri" w:eastAsia="Calibri" w:hAnsi="Calibri"/>
-                <w:b/>
-                <w:bCs/>
-                <w:color w:val="1E7E42"/>
-                <w:sz w:val="21"/>
-                <w:szCs w:val="21"/>
-              </w:rPr>
-              <w:t xml:space="preserve">Devoir de conseil</w:t>
-            </w:r>
-          </w:p>
-          <w:p>
-            <w:r>
-              <w:rPr>
-                <w:rFonts w:ascii="Calibri" w:cs="Calibri" w:eastAsia="Calibri" w:hAnsi="Calibri"/>
-                <w:color w:val="222222"/>
-                <w:sz w:val="21"/>
-                <w:szCs w:val="21"/>
-              </w:rPr>
-              <w:t xml:space="preserve">Avant toute manipulation « avancée », expliquez au client les risques (garantie, sécurité, fonctions bancaires) et faites-lui confirmer par écrit. C'est un service légitime, mais le client doit décider en connaissance de cause.</w:t>
-            </w:r>
-          </w:p>
-        </w:tc>
-      </w:tr>
-    </w:tbl>
-    <w:p>
-      <w:pPr>
-        <w:spacing w:after="80"/>
-      </w:pPr>
-    </w:p>
-    <w:p>
-      <w:r>
-        <w:br w:type="page"/>
-      </w:r>
-    </w:p>
-    <w:p>
-      <w:r>
-        <w:br w:type="page"/>
-      </w:r>
-    </w:p>
-    <w:p>
-      <w:pPr>
-        <w:pStyle w:val="Heading1"/>
-        <w:spacing w:after="0" w:before="0"/>
-      </w:pPr>
-      <w:r>
-        <w:rPr>
-          <w:rFonts w:ascii="Calibri" w:cs="Calibri" w:eastAsia="Calibri" w:hAnsi="Calibri"/>
-          <w:color w:val="FFFFFF"/>
-          <w:sz w:val="2"/>
-          <w:szCs w:val="2"/>
-        </w:rPr>
-        <w:t xml:space="preserve">Partie 7 — Dépannage : bootloop, brick, échecs de flash</w:t>
-      </w:r>
-    </w:p>
-    <w:tbl>
-      <w:tblPr>
-        <w:tblW w:type="pct" w:w="100%"/>
-        <w:tblBorders>
-          <w:top w:val="none" w:color="FFFFFF" w:sz="0"/>
-          <w:left w:val="none" w:color="FFFFFF" w:sz="0"/>
-          <w:bottom w:val="none" w:color="FFFFFF" w:sz="0"/>
-          <w:right w:val="none" w:color="FFFFFF" w:sz="0"/>
-          <w:insideH w:val="none" w:color="FFFFFF" w:sz="0"/>
-          <w:insideV w:val="none" w:color="FFFFFF" w:sz="0"/>
-        </w:tblBorders>
-      </w:tblPr>
-      <w:tblGrid>
-        <w:gridCol w:w="9360"/>
-      </w:tblGrid>
-      <w:tr>
-        <w:tc>
-          <w:tcPr>
-            <w:tcW w:type="dxa" w:w="9360"/>
-            <w:shd w:fill="1F3A5F" w:color="auto" w:val="clear"/>
-            <w:tcMar>
-              <w:top w:type="dxa" w:w="300"/>
-              <w:left w:type="dxa" w:w="320"/>
-              <w:bottom w:type="dxa" w:w="320"/>
-              <w:right w:type="dxa" w:w="320"/>
-            </w:tcMar>
-          </w:tcPr>
-          <w:p>
-            <w:pPr>
-              <w:spacing w:after="40"/>
-            </w:pPr>
-            <w:r>
-              <w:rPr>
-                <w:rFonts w:ascii="Calibri" w:cs="Calibri" w:eastAsia="Calibri" w:hAnsi="Calibri"/>
-                <w:b/>
-                <w:bCs/>
-                <w:color w:val="9FC4E6"/>
-                <w:spacing w:val="60"/>
-                <w:sz w:val="20"/>
-                <w:szCs w:val="20"/>
-              </w:rPr>
-              <w:t xml:space="preserve">PARTIE 7</w:t>
-            </w:r>
-          </w:p>
-          <w:p>
-            <w:r>
-              <w:rPr>
-                <w:rFonts w:ascii="Calibri" w:cs="Calibri" w:eastAsia="Calibri" w:hAnsi="Calibri"/>
-                <w:b/>
-                <w:bCs/>
-                <w:color w:val="FFFFFF"/>
-                <w:sz w:val="40"/>
-                <w:szCs w:val="40"/>
-              </w:rPr>
-              <w:t xml:space="preserve">Dépannage : bootloop, brick, échecs de flash</w:t>
-            </w:r>
-          </w:p>
-        </w:tc>
-      </w:tr>
-    </w:tbl>
-    <w:p>
-      <w:pPr>
-        <w:spacing w:after="80"/>
-      </w:pPr>
-    </w:p>
-    <w:p>
-      <w:pPr>
-        <w:spacing w:after="120" w:line="276"/>
-        <w:jc w:val="both"/>
-      </w:pPr>
-      <w:r>
-        <w:rPr>
-          <w:rFonts w:ascii="Calibri" w:cs="Calibri" w:eastAsia="Calibri" w:hAnsi="Calibri"/>
-          <w:sz w:val="22"/>
-          <w:szCs w:val="22"/>
-        </w:rPr>
-        <w:t xml:space="preserve">Un appareil « bloqué au logo », qui redémarre en boucle (bootloop) ou totalement éteint (brick) est très souvent récupérable par voie logicielle. Méthode :</w:t>
-      </w:r>
     </w:p>
     <w:p>
       <w:pPr>
@@ -3688,7 +2436,7 @@
       <w:r>
         <w:drawing>
           <wp:inline distT="0" distB="0" distL="0" distR="0">
-            <wp:extent cx="4476750" cy="2143125"/>
+            <wp:extent cx="4476750" cy="3009900"/>
             <wp:effectExtent t="0" r="0" b="0" l="0"/>
             <wp:docPr id="1" name="" descr="" title=""/>
             <wp:cNvGraphicFramePr>
@@ -3713,6 +2461,1510 @@
                   <pic:spPr bwMode="auto">
                     <a:xfrm>
                       <a:off x="0" y="0"/>
+                      <a:ext cx="4476750" cy="3009900"/>
+                    </a:xfrm>
+                    <a:prstGeom prst="rect">
+                      <a:avLst/>
+                    </a:prstGeom>
+                  </pic:spPr>
+                </pic:pic>
+              </a:graphicData>
+            </a:graphic>
+          </wp:inline>
+        </w:drawing>
+      </w:r>
+    </w:p>
+    <w:p>
+      <w:pPr>
+        <w:spacing w:after="160"/>
+        <w:jc w:val="center"/>
+      </w:pPr>
+      <w:r>
+        <w:rPr>
+          <w:rFonts w:ascii="Calibri" w:cs="Calibri" w:eastAsia="Calibri" w:hAnsi="Calibri"/>
+          <w:i/>
+          <w:iCs/>
+          <w:color w:val="555555"/>
+          <w:sz w:val="17"/>
+          <w:szCs w:val="17"/>
+        </w:rPr>
+        <w:t xml:space="preserve">Les étapes d'un flashage en mode Fastboot (images d'usine officielles).</w:t>
+      </w:r>
+    </w:p>
+    <w:p>
+      <w:pPr>
+        <w:pStyle w:val="Heading2"/>
+        <w:spacing w:after="100" w:before="220"/>
+      </w:pPr>
+      <w:r>
+        <w:rPr>
+          <w:rFonts w:ascii="Calibri" w:cs="Calibri" w:eastAsia="Calibri" w:hAnsi="Calibri"/>
+          <w:b/>
+          <w:bCs/>
+          <w:color w:val="2E5E8C"/>
+          <w:sz w:val="26"/>
+          <w:szCs w:val="26"/>
+        </w:rPr>
+        <w:t xml:space="preserve">9. MediaTek (SP Flash Tool) et Qualcomm (EDL)</w:t>
+      </w:r>
+    </w:p>
+    <w:p>
+      <w:pPr>
+        <w:pStyle w:val="ListParagraph"/>
+        <w:numPr>
+          <w:ilvl w:val="0"/>
+          <w:numId w:val="1"/>
+        </w:numPr>
+        <w:spacing w:after="60" w:line="264"/>
+      </w:pPr>
+      <w:r>
+        <w:rPr>
+          <w:rFonts w:ascii="Calibri" w:cs="Calibri" w:eastAsia="Calibri" w:hAnsi="Calibri"/>
+          <w:sz w:val="22"/>
+          <w:szCs w:val="22"/>
+        </w:rPr>
+        <w:t xml:space="preserve">MediaTek : on charge un fichier « scatter » (qui décrit les partitions) dans SP Flash Tool, on sélectionne les partitions à écrire, puis on connecte l'appareil éteint pour lancer le flash.</w:t>
+      </w:r>
+    </w:p>
+    <w:p>
+      <w:pPr>
+        <w:pStyle w:val="ListParagraph"/>
+        <w:numPr>
+          <w:ilvl w:val="0"/>
+          <w:numId w:val="1"/>
+        </w:numPr>
+        <w:spacing w:after="60" w:line="264"/>
+      </w:pPr>
+      <w:r>
+        <w:rPr>
+          <w:rFonts w:ascii="Calibri" w:cs="Calibri" w:eastAsia="Calibri" w:hAnsi="Calibri"/>
+          <w:sz w:val="22"/>
+          <w:szCs w:val="22"/>
+        </w:rPr>
+        <w:t xml:space="preserve">Qualcomm EDL (« 9008 ») : mode d'urgence de bas niveau, utilisé quand l'appareil ne démarre plus ; il nécessite les bons pilotes et un fichier de programmation (firehose). Réservé aux cas avancés.</w:t>
+      </w:r>
+    </w:p>
+    <w:p>
+      <w:pPr>
+        <w:pStyle w:val="ListParagraph"/>
+        <w:numPr>
+          <w:ilvl w:val="0"/>
+          <w:numId w:val="1"/>
+        </w:numPr>
+        <w:spacing w:after="60" w:line="264"/>
+      </w:pPr>
+      <w:r>
+        <w:rPr>
+          <w:rFonts w:ascii="Calibri" w:cs="Calibri" w:eastAsia="Calibri" w:hAnsi="Calibri"/>
+          <w:sz w:val="22"/>
+          <w:szCs w:val="22"/>
+        </w:rPr>
+        <w:t xml:space="preserve">Ces méthodes sont puissantes mais risquées : un mauvais scatter/firmware peut briquer l'appareil. À réserver quand on maîtrise, sur des firmwares officiels.</w:t>
+      </w:r>
+    </w:p>
+    <w:p>
+      <w:pPr>
+        <w:spacing w:after="80"/>
+      </w:pPr>
+    </w:p>
+    <w:tbl>
+      <w:tblPr>
+        <w:tblW w:type="pct" w:w="100%"/>
+        <w:tblBorders>
+          <w:top w:val="none" w:color="FFFFFF" w:sz="0"/>
+          <w:left w:val="none" w:color="FFFFFF" w:sz="0"/>
+          <w:bottom w:val="none" w:color="FFFFFF" w:sz="0"/>
+          <w:right w:val="none" w:color="FFFFFF" w:sz="0"/>
+          <w:insideH w:val="none" w:color="FFFFFF" w:sz="0"/>
+          <w:insideV w:val="none" w:color="FFFFFF" w:sz="0"/>
+        </w:tblBorders>
+      </w:tblPr>
+      <w:tblGrid>
+        <w:gridCol w:w="200"/>
+        <w:gridCol w:w="9160"/>
+      </w:tblGrid>
+      <w:tr>
+        <w:tc>
+          <w:tcPr>
+            <w:tcW w:type="dxa" w:w="200"/>
+            <w:shd w:fill="C0392B" w:color="auto" w:val="clear"/>
+          </w:tcPr>
+          <w:p>
+            <w:r>
+              <w:rPr>
+                <w:rFonts w:ascii="Calibri" w:cs="Calibri" w:eastAsia="Calibri" w:hAnsi="Calibri"/>
+              </w:rPr>
+              <w:t xml:space="preserve"> </w:t>
+            </w:r>
+          </w:p>
+        </w:tc>
+        <w:tc>
+          <w:tcPr>
+            <w:tcW w:type="dxa" w:w="9160"/>
+            <w:shd w:fill="FDECEA" w:color="auto" w:val="clear"/>
+            <w:tcMar>
+              <w:top w:type="dxa" w:w="120"/>
+              <w:left w:type="dxa" w:w="160"/>
+              <w:bottom w:type="dxa" w:w="120"/>
+              <w:right w:type="dxa" w:w="160"/>
+            </w:tcMar>
+          </w:tcPr>
+          <w:p>
+            <w:pPr>
+              <w:spacing w:after="40"/>
+            </w:pPr>
+            <w:r>
+              <w:rPr>
+                <w:rFonts w:ascii="Calibri" w:cs="Calibri" w:eastAsia="Calibri" w:hAnsi="Calibri"/>
+                <w:b/>
+                <w:bCs/>
+                <w:color w:val="C0392B"/>
+                <w:sz w:val="21"/>
+                <w:szCs w:val="21"/>
+              </w:rPr>
+              <w:t xml:space="preserve">Attention IMEI / baseband</w:t>
+            </w:r>
+          </w:p>
+          <w:p>
+            <w:r>
+              <w:rPr>
+                <w:rFonts w:ascii="Calibri" w:cs="Calibri" w:eastAsia="Calibri" w:hAnsi="Calibri"/>
+                <w:color w:val="222222"/>
+                <w:sz w:val="21"/>
+                <w:szCs w:val="21"/>
+              </w:rPr>
+              <w:t xml:space="preserve">Ne cherchez jamais à « régénérer » ou modifier un IMEI. Après un flash, si le réseau ne fonctionne plus, la solution légale est de reflasher le bon firmware/modem officiel — jamais d'écrire un IMEI. La modification d'IMEI est illégale.</w:t>
+            </w:r>
+          </w:p>
+        </w:tc>
+      </w:tr>
+    </w:tbl>
+    <w:p>
+      <w:pPr>
+        <w:spacing w:after="80"/>
+      </w:pPr>
+    </w:p>
+    <w:p>
+      <w:r>
+        <w:br w:type="page"/>
+      </w:r>
+    </w:p>
+    <w:p>
+      <w:r>
+        <w:br w:type="page"/>
+      </w:r>
+    </w:p>
+    <w:p>
+      <w:pPr>
+        <w:pStyle w:val="Heading1"/>
+        <w:spacing w:after="0" w:before="0"/>
+      </w:pPr>
+      <w:r>
+        <w:rPr>
+          <w:rFonts w:ascii="Calibri" w:cs="Calibri" w:eastAsia="Calibri" w:hAnsi="Calibri"/>
+          <w:color w:val="FFFFFF"/>
+          <w:sz w:val="2"/>
+          <w:szCs w:val="2"/>
+        </w:rPr>
+        <w:t xml:space="preserve">Partie 4 — Flashage / restauration iPhone &amp; iPad</w:t>
+      </w:r>
+    </w:p>
+    <w:tbl>
+      <w:tblPr>
+        <w:tblW w:type="pct" w:w="100%"/>
+        <w:tblBorders>
+          <w:top w:val="none" w:color="FFFFFF" w:sz="0"/>
+          <w:left w:val="none" w:color="FFFFFF" w:sz="0"/>
+          <w:bottom w:val="none" w:color="FFFFFF" w:sz="0"/>
+          <w:right w:val="none" w:color="FFFFFF" w:sz="0"/>
+          <w:insideH w:val="none" w:color="FFFFFF" w:sz="0"/>
+          <w:insideV w:val="none" w:color="FFFFFF" w:sz="0"/>
+        </w:tblBorders>
+      </w:tblPr>
+      <w:tblGrid>
+        <w:gridCol w:w="9360"/>
+      </w:tblGrid>
+      <w:tr>
+        <w:tc>
+          <w:tcPr>
+            <w:tcW w:type="dxa" w:w="9360"/>
+            <w:shd w:fill="1F3A5F" w:color="auto" w:val="clear"/>
+            <w:tcMar>
+              <w:top w:type="dxa" w:w="300"/>
+              <w:left w:type="dxa" w:w="320"/>
+              <w:bottom w:type="dxa" w:w="320"/>
+              <w:right w:type="dxa" w:w="320"/>
+            </w:tcMar>
+          </w:tcPr>
+          <w:p>
+            <w:pPr>
+              <w:spacing w:after="40"/>
+            </w:pPr>
+            <w:r>
+              <w:rPr>
+                <w:rFonts w:ascii="Calibri" w:cs="Calibri" w:eastAsia="Calibri" w:hAnsi="Calibri"/>
+                <w:b/>
+                <w:bCs/>
+                <w:color w:val="9FC4E6"/>
+                <w:spacing w:val="60"/>
+                <w:sz w:val="20"/>
+                <w:szCs w:val="20"/>
+              </w:rPr>
+              <w:t xml:space="preserve">PARTIE 4</w:t>
+            </w:r>
+          </w:p>
+          <w:p>
+            <w:r>
+              <w:rPr>
+                <w:rFonts w:ascii="Calibri" w:cs="Calibri" w:eastAsia="Calibri" w:hAnsi="Calibri"/>
+                <w:b/>
+                <w:bCs/>
+                <w:color w:val="FFFFFF"/>
+                <w:sz w:val="40"/>
+                <w:szCs w:val="40"/>
+              </w:rPr>
+              <w:t xml:space="preserve">Flashage / restauration iPhone &amp; iPad</w:t>
+            </w:r>
+          </w:p>
+        </w:tc>
+      </w:tr>
+    </w:tbl>
+    <w:p>
+      <w:pPr>
+        <w:spacing w:after="80"/>
+      </w:pPr>
+    </w:p>
+    <w:p>
+      <w:pPr>
+        <w:spacing w:after="120" w:line="276"/>
+        <w:jc w:val="both"/>
+      </w:pPr>
+      <w:r>
+        <w:rPr>
+          <w:rFonts w:ascii="Calibri" w:cs="Calibri" w:eastAsia="Calibri" w:hAnsi="Calibri"/>
+          <w:sz w:val="22"/>
+          <w:szCs w:val="22"/>
+        </w:rPr>
+        <w:t xml:space="preserve">Chez Apple, tout passe par une restauration officielle avec un fichier IPSW, via Finder (macOS récent) ou iTunes (Windows/macOS ancien). Deux modes existent : Recovery et DFU.</w:t>
+      </w:r>
+    </w:p>
+    <w:p>
+      <w:pPr>
+        <w:pStyle w:val="Heading2"/>
+        <w:spacing w:after="100" w:before="220"/>
+      </w:pPr>
+      <w:r>
+        <w:rPr>
+          <w:rFonts w:ascii="Calibri" w:cs="Calibri" w:eastAsia="Calibri" w:hAnsi="Calibri"/>
+          <w:b/>
+          <w:bCs/>
+          <w:color w:val="2E5E8C"/>
+          <w:sz w:val="26"/>
+          <w:szCs w:val="26"/>
+        </w:rPr>
+        <w:t xml:space="preserve">10. Modes Recovery et DFU</w:t>
+      </w:r>
+    </w:p>
+    <w:p>
+      <w:pPr>
+        <w:pStyle w:val="ListParagraph"/>
+        <w:numPr>
+          <w:ilvl w:val="0"/>
+          <w:numId w:val="1"/>
+        </w:numPr>
+        <w:spacing w:after="60" w:line="264"/>
+      </w:pPr>
+      <w:r>
+        <w:rPr>
+          <w:rFonts w:ascii="Calibri" w:cs="Calibri" w:eastAsia="Calibri" w:hAnsi="Calibri"/>
+          <w:sz w:val="22"/>
+          <w:szCs w:val="22"/>
+        </w:rPr>
+        <w:t xml:space="preserve">Mode Recovery (récupération) : l'écran affiche une invite de connexion à l'ordinateur. Suffisant pour la plupart des restaurations.</w:t>
+      </w:r>
+    </w:p>
+    <w:p>
+      <w:pPr>
+        <w:pStyle w:val="ListParagraph"/>
+        <w:numPr>
+          <w:ilvl w:val="0"/>
+          <w:numId w:val="1"/>
+        </w:numPr>
+        <w:spacing w:after="60" w:line="264"/>
+      </w:pPr>
+      <w:r>
+        <w:rPr>
+          <w:rFonts w:ascii="Calibri" w:cs="Calibri" w:eastAsia="Calibri" w:hAnsi="Calibri"/>
+          <w:sz w:val="22"/>
+          <w:szCs w:val="22"/>
+        </w:rPr>
+        <w:t xml:space="preserve">Mode DFU (Device Firmware Update) : plus bas niveau, écran totalement noir ; utile quand la Recovery ne suffit pas. On l'active par une séquence précise de boutons propre à chaque modèle.</w:t>
+      </w:r>
+    </w:p>
+    <w:p>
+      <w:pPr>
+        <w:pStyle w:val="ListParagraph"/>
+        <w:numPr>
+          <w:ilvl w:val="0"/>
+          <w:numId w:val="1"/>
+        </w:numPr>
+        <w:spacing w:after="60" w:line="264"/>
+      </w:pPr>
+      <w:r>
+        <w:rPr>
+          <w:rFonts w:ascii="Calibri" w:cs="Calibri" w:eastAsia="Calibri" w:hAnsi="Calibri"/>
+          <w:sz w:val="22"/>
+          <w:szCs w:val="22"/>
+        </w:rPr>
+        <w:t xml:space="preserve">Dans les deux cas, on branche l'appareil, on ouvre Finder/iTunes, et on choisit « Restaurer » (avec un IPSW compatible).</w:t>
+      </w:r>
+    </w:p>
+    <w:p>
+      <w:pPr>
+        <w:spacing w:after="80"/>
+      </w:pPr>
+    </w:p>
+    <w:p>
+      <w:pPr>
+        <w:pStyle w:val="Heading2"/>
+        <w:spacing w:after="100" w:before="220"/>
+      </w:pPr>
+      <w:r>
+        <w:rPr>
+          <w:rFonts w:ascii="Calibri" w:cs="Calibri" w:eastAsia="Calibri" w:hAnsi="Calibri"/>
+          <w:b/>
+          <w:bCs/>
+          <w:color w:val="2E5E8C"/>
+          <w:sz w:val="26"/>
+          <w:szCs w:val="26"/>
+        </w:rPr>
+        <w:t xml:space="preserve">11. Restaurer proprement</w:t>
+      </w:r>
+    </w:p>
+    <w:p>
+      <w:pPr>
+        <w:pStyle w:val="ListParagraph"/>
+        <w:numPr>
+          <w:ilvl w:val="0"/>
+          <w:numId w:val="2"/>
+        </w:numPr>
+        <w:spacing w:after="60" w:line="264"/>
+      </w:pPr>
+      <w:r>
+        <w:rPr>
+          <w:rFonts w:ascii="Calibri" w:cs="Calibri" w:eastAsia="Calibri" w:hAnsi="Calibri"/>
+          <w:sz w:val="22"/>
+          <w:szCs w:val="22"/>
+        </w:rPr>
+        <w:t xml:space="preserve">Sauvegarder si l'appareil est encore accessible.</w:t>
+      </w:r>
+    </w:p>
+    <w:p>
+      <w:pPr>
+        <w:pStyle w:val="ListParagraph"/>
+        <w:numPr>
+          <w:ilvl w:val="0"/>
+          <w:numId w:val="2"/>
+        </w:numPr>
+        <w:spacing w:after="60" w:line="264"/>
+      </w:pPr>
+      <w:r>
+        <w:rPr>
+          <w:rFonts w:ascii="Calibri" w:cs="Calibri" w:eastAsia="Calibri" w:hAnsi="Calibri"/>
+          <w:sz w:val="22"/>
+          <w:szCs w:val="22"/>
+        </w:rPr>
+        <w:t xml:space="preserve">Brancher l'appareil et le mettre en mode Recovery (ou DFU si nécessaire).</w:t>
+      </w:r>
+    </w:p>
+    <w:p>
+      <w:pPr>
+        <w:pStyle w:val="ListParagraph"/>
+        <w:numPr>
+          <w:ilvl w:val="0"/>
+          <w:numId w:val="2"/>
+        </w:numPr>
+        <w:spacing w:after="60" w:line="264"/>
+      </w:pPr>
+      <w:r>
+        <w:rPr>
+          <w:rFonts w:ascii="Calibri" w:cs="Calibri" w:eastAsia="Calibri" w:hAnsi="Calibri"/>
+          <w:sz w:val="22"/>
+          <w:szCs w:val="22"/>
+        </w:rPr>
+        <w:t xml:space="preserve">Dans Finder/iTunes, choisir « Restaurer l'iPhone » ; l'outil télécharge/installe la version compatible signée par Apple.</w:t>
+      </w:r>
+    </w:p>
+    <w:p>
+      <w:pPr>
+        <w:pStyle w:val="ListParagraph"/>
+        <w:numPr>
+          <w:ilvl w:val="0"/>
+          <w:numId w:val="2"/>
+        </w:numPr>
+        <w:spacing w:after="60" w:line="264"/>
+      </w:pPr>
+      <w:r>
+        <w:rPr>
+          <w:rFonts w:ascii="Calibri" w:cs="Calibri" w:eastAsia="Calibri" w:hAnsi="Calibri"/>
+          <w:sz w:val="22"/>
+          <w:szCs w:val="22"/>
+        </w:rPr>
+        <w:t xml:space="preserve">Laisser l'opération se terminer sans débrancher ; l'appareil redémarre « comme neuf ».</w:t>
+      </w:r>
+    </w:p>
+    <w:p>
+      <w:pPr>
+        <w:spacing w:after="80"/>
+      </w:pPr>
+    </w:p>
+    <w:p>
+      <w:pPr>
+        <w:spacing w:after="40" w:before="120"/>
+        <w:jc w:val="center"/>
+      </w:pPr>
+      <w:r>
+        <w:drawing>
+          <wp:inline distT="0" distB="0" distL="0" distR="0">
+            <wp:extent cx="4476750" cy="3009900"/>
+            <wp:effectExtent t="0" r="0" b="0" l="0"/>
+            <wp:docPr id="1" name="" descr="" title=""/>
+            <wp:cNvGraphicFramePr>
+              <a:graphicFrameLocks xmlns:a="http://schemas.openxmlformats.org/drawingml/2006/main" noChangeAspect="1"/>
+            </wp:cNvGraphicFramePr>
+            <a:graphic xmlns:a="http://schemas.openxmlformats.org/drawingml/2006/main">
+              <a:graphicData uri="http://schemas.openxmlformats.org/drawingml/2006/picture">
+                <pic:pic xmlns:pic="http://schemas.openxmlformats.org/drawingml/2006/picture">
+                  <pic:nvPicPr>
+                    <pic:cNvPr id="0" name="" descr=""/>
+                    <pic:cNvPicPr>
+                      <a:picLocks noChangeAspect="1" noChangeArrowheads="1"/>
+                    </pic:cNvPicPr>
+                  </pic:nvPicPr>
+                  <pic:blipFill>
+                    <a:blip r:embed="rId14" cstate="none"/>
+                    <a:srcRect/>
+                    <a:stretch>
+                      <a:fillRect/>
+                    </a:stretch>
+                  </pic:blipFill>
+                  <pic:spPr bwMode="auto">
+                    <a:xfrm>
+                      <a:off x="0" y="0"/>
+                      <a:ext cx="4476750" cy="3009900"/>
+                    </a:xfrm>
+                    <a:prstGeom prst="rect">
+                      <a:avLst/>
+                    </a:prstGeom>
+                  </pic:spPr>
+                </pic:pic>
+              </a:graphicData>
+            </a:graphic>
+          </wp:inline>
+        </w:drawing>
+      </w:r>
+    </w:p>
+    <w:p>
+      <w:pPr>
+        <w:spacing w:after="160"/>
+        <w:jc w:val="center"/>
+      </w:pPr>
+      <w:r>
+        <w:rPr>
+          <w:rFonts w:ascii="Calibri" w:cs="Calibri" w:eastAsia="Calibri" w:hAnsi="Calibri"/>
+          <w:i/>
+          <w:iCs/>
+          <w:color w:val="555555"/>
+          <w:sz w:val="17"/>
+          <w:szCs w:val="17"/>
+        </w:rPr>
+        <w:t xml:space="preserve">Les étapes de la restauration d'un iPhone via Recovery / DFU.</w:t>
+      </w:r>
+    </w:p>
+    <w:tbl>
+      <w:tblPr>
+        <w:tblW w:type="pct" w:w="100%"/>
+        <w:tblBorders>
+          <w:top w:val="none" w:color="FFFFFF" w:sz="0"/>
+          <w:left w:val="none" w:color="FFFFFF" w:sz="0"/>
+          <w:bottom w:val="none" w:color="FFFFFF" w:sz="0"/>
+          <w:right w:val="none" w:color="FFFFFF" w:sz="0"/>
+          <w:insideH w:val="none" w:color="FFFFFF" w:sz="0"/>
+          <w:insideV w:val="none" w:color="FFFFFF" w:sz="0"/>
+        </w:tblBorders>
+      </w:tblPr>
+      <w:tblGrid>
+        <w:gridCol w:w="200"/>
+        <w:gridCol w:w="9160"/>
+      </w:tblGrid>
+      <w:tr>
+        <w:tc>
+          <w:tcPr>
+            <w:tcW w:type="dxa" w:w="200"/>
+            <w:shd w:fill="C0392B" w:color="auto" w:val="clear"/>
+          </w:tcPr>
+          <w:p>
+            <w:r>
+              <w:rPr>
+                <w:rFonts w:ascii="Calibri" w:cs="Calibri" w:eastAsia="Calibri" w:hAnsi="Calibri"/>
+              </w:rPr>
+              <w:t xml:space="preserve"> </w:t>
+            </w:r>
+          </w:p>
+        </w:tc>
+        <w:tc>
+          <w:tcPr>
+            <w:tcW w:type="dxa" w:w="9160"/>
+            <w:shd w:fill="FDECEA" w:color="auto" w:val="clear"/>
+            <w:tcMar>
+              <w:top w:type="dxa" w:w="120"/>
+              <w:left w:type="dxa" w:w="160"/>
+              <w:bottom w:type="dxa" w:w="120"/>
+              <w:right w:type="dxa" w:w="160"/>
+            </w:tcMar>
+          </w:tcPr>
+          <w:p>
+            <w:pPr>
+              <w:spacing w:after="40"/>
+            </w:pPr>
+            <w:r>
+              <w:rPr>
+                <w:rFonts w:ascii="Calibri" w:cs="Calibri" w:eastAsia="Calibri" w:hAnsi="Calibri"/>
+                <w:b/>
+                <w:bCs/>
+                <w:color w:val="C0392B"/>
+                <w:sz w:val="21"/>
+                <w:szCs w:val="21"/>
+              </w:rPr>
+              <w:t xml:space="preserve">Verrouillage d'activation (iCloud)</w:t>
+            </w:r>
+          </w:p>
+          <w:p>
+            <w:r>
+              <w:rPr>
+                <w:rFonts w:ascii="Calibri" w:cs="Calibri" w:eastAsia="Calibri" w:hAnsi="Calibri"/>
+                <w:color w:val="222222"/>
+                <w:sz w:val="21"/>
+                <w:szCs w:val="21"/>
+              </w:rPr>
+              <w:t xml:space="preserve">Après restauration, l'iPhone redemandera l'identifiant Apple d'origine si le « Localiser » (verrouillage d'activation) était actif. C'est une protection antivol : elle ne se contourne PAS. Le propriétaire légitime doit se connecter avec son compte, ou faire retirer le verrou par Apple sur preuve d'achat. Un iPhone verrouillé sans preuve de propriété ne doit pas être accepté.</w:t>
+            </w:r>
+          </w:p>
+        </w:tc>
+      </w:tr>
+    </w:tbl>
+    <w:p>
+      <w:pPr>
+        <w:spacing w:after="80"/>
+      </w:pPr>
+    </w:p>
+    <w:p>
+      <w:r>
+        <w:br w:type="page"/>
+      </w:r>
+    </w:p>
+    <w:p>
+      <w:r>
+        <w:br w:type="page"/>
+      </w:r>
+    </w:p>
+    <w:p>
+      <w:pPr>
+        <w:pStyle w:val="Heading1"/>
+        <w:spacing w:after="0" w:before="0"/>
+      </w:pPr>
+      <w:r>
+        <w:rPr>
+          <w:rFonts w:ascii="Calibri" w:cs="Calibri" w:eastAsia="Calibri" w:hAnsi="Calibri"/>
+          <w:color w:val="FFFFFF"/>
+          <w:sz w:val="2"/>
+          <w:szCs w:val="2"/>
+        </w:rPr>
+        <w:t xml:space="preserve">Partie 5 — Déblocage réseau (désimlockage) légal</w:t>
+      </w:r>
+    </w:p>
+    <w:tbl>
+      <w:tblPr>
+        <w:tblW w:type="pct" w:w="100%"/>
+        <w:tblBorders>
+          <w:top w:val="none" w:color="FFFFFF" w:sz="0"/>
+          <w:left w:val="none" w:color="FFFFFF" w:sz="0"/>
+          <w:bottom w:val="none" w:color="FFFFFF" w:sz="0"/>
+          <w:right w:val="none" w:color="FFFFFF" w:sz="0"/>
+          <w:insideH w:val="none" w:color="FFFFFF" w:sz="0"/>
+          <w:insideV w:val="none" w:color="FFFFFF" w:sz="0"/>
+        </w:tblBorders>
+      </w:tblPr>
+      <w:tblGrid>
+        <w:gridCol w:w="9360"/>
+      </w:tblGrid>
+      <w:tr>
+        <w:tc>
+          <w:tcPr>
+            <w:tcW w:type="dxa" w:w="9360"/>
+            <w:shd w:fill="1F3A5F" w:color="auto" w:val="clear"/>
+            <w:tcMar>
+              <w:top w:type="dxa" w:w="300"/>
+              <w:left w:type="dxa" w:w="320"/>
+              <w:bottom w:type="dxa" w:w="320"/>
+              <w:right w:type="dxa" w:w="320"/>
+            </w:tcMar>
+          </w:tcPr>
+          <w:p>
+            <w:pPr>
+              <w:spacing w:after="40"/>
+            </w:pPr>
+            <w:r>
+              <w:rPr>
+                <w:rFonts w:ascii="Calibri" w:cs="Calibri" w:eastAsia="Calibri" w:hAnsi="Calibri"/>
+                <w:b/>
+                <w:bCs/>
+                <w:color w:val="9FC4E6"/>
+                <w:spacing w:val="60"/>
+                <w:sz w:val="20"/>
+                <w:szCs w:val="20"/>
+              </w:rPr>
+              <w:t xml:space="preserve">PARTIE 5</w:t>
+            </w:r>
+          </w:p>
+          <w:p>
+            <w:r>
+              <w:rPr>
+                <w:rFonts w:ascii="Calibri" w:cs="Calibri" w:eastAsia="Calibri" w:hAnsi="Calibri"/>
+                <w:b/>
+                <w:bCs/>
+                <w:color w:val="FFFFFF"/>
+                <w:sz w:val="40"/>
+                <w:szCs w:val="40"/>
+              </w:rPr>
+              <w:t xml:space="preserve">Déblocage réseau (désimlockage) légal</w:t>
+            </w:r>
+          </w:p>
+        </w:tc>
+      </w:tr>
+    </w:tbl>
+    <w:p>
+      <w:pPr>
+        <w:spacing w:after="80"/>
+      </w:pPr>
+    </w:p>
+    <w:p>
+      <w:pPr>
+        <w:spacing w:after="120" w:line="276"/>
+        <w:jc w:val="both"/>
+      </w:pPr>
+      <w:r>
+        <w:rPr>
+          <w:rFonts w:ascii="Calibri" w:cs="Calibri" w:eastAsia="Calibri" w:hAnsi="Calibri"/>
+          <w:sz w:val="22"/>
+          <w:szCs w:val="22"/>
+        </w:rPr>
+        <w:t xml:space="preserve">Le déblocage réseau permet à un téléphone « bloqué » sur un opérateur d'accepter les cartes SIM d'autres opérateurs. C'est un service parfaitement légal — à condition de le faire par les voies autorisées et sur un appareil dont la propriété est établie.</w:t>
+      </w:r>
+    </w:p>
+    <w:p>
+      <w:pPr>
+        <w:spacing w:after="40" w:before="120"/>
+        <w:jc w:val="center"/>
+      </w:pPr>
+      <w:r>
+        <w:drawing>
+          <wp:inline distT="0" distB="0" distL="0" distR="0">
+            <wp:extent cx="4476750" cy="1885950"/>
+            <wp:effectExtent t="0" r="0" b="0" l="0"/>
+            <wp:docPr id="1" name="" descr="" title=""/>
+            <wp:cNvGraphicFramePr>
+              <a:graphicFrameLocks xmlns:a="http://schemas.openxmlformats.org/drawingml/2006/main" noChangeAspect="1"/>
+            </wp:cNvGraphicFramePr>
+            <a:graphic xmlns:a="http://schemas.openxmlformats.org/drawingml/2006/main">
+              <a:graphicData uri="http://schemas.openxmlformats.org/drawingml/2006/picture">
+                <pic:pic xmlns:pic="http://schemas.openxmlformats.org/drawingml/2006/picture">
+                  <pic:nvPicPr>
+                    <pic:cNvPr id="0" name="" descr=""/>
+                    <pic:cNvPicPr>
+                      <a:picLocks noChangeAspect="1" noChangeArrowheads="1"/>
+                    </pic:cNvPicPr>
+                  </pic:nvPicPr>
+                  <pic:blipFill>
+                    <a:blip r:embed="rId15" cstate="none"/>
+                    <a:srcRect/>
+                    <a:stretch>
+                      <a:fillRect/>
+                    </a:stretch>
+                  </pic:blipFill>
+                  <pic:spPr bwMode="auto">
+                    <a:xfrm>
+                      <a:off x="0" y="0"/>
+                      <a:ext cx="4476750" cy="1885950"/>
+                    </a:xfrm>
+                    <a:prstGeom prst="rect">
+                      <a:avLst/>
+                    </a:prstGeom>
+                  </pic:spPr>
+                </pic:pic>
+              </a:graphicData>
+            </a:graphic>
+          </wp:inline>
+        </w:drawing>
+      </w:r>
+    </w:p>
+    <w:p>
+      <w:pPr>
+        <w:spacing w:after="160"/>
+        <w:jc w:val="center"/>
+      </w:pPr>
+      <w:r>
+        <w:rPr>
+          <w:rFonts w:ascii="Calibri" w:cs="Calibri" w:eastAsia="Calibri" w:hAnsi="Calibri"/>
+          <w:i/>
+          <w:iCs/>
+          <w:color w:val="555555"/>
+          <w:sz w:val="17"/>
+          <w:szCs w:val="17"/>
+        </w:rPr>
+        <w:t xml:space="preserve">Déblocage réseau : les méthodes autorisées et celles à refuser absolument.</w:t>
+      </w:r>
+    </w:p>
+    <w:p>
+      <w:pPr>
+        <w:pStyle w:val="Heading2"/>
+        <w:spacing w:after="100" w:before="220"/>
+      </w:pPr>
+      <w:r>
+        <w:rPr>
+          <w:rFonts w:ascii="Calibri" w:cs="Calibri" w:eastAsia="Calibri" w:hAnsi="Calibri"/>
+          <w:b/>
+          <w:bCs/>
+          <w:color w:val="2E5E8C"/>
+          <w:sz w:val="26"/>
+          <w:szCs w:val="26"/>
+        </w:rPr>
+        <w:t xml:space="preserve">12. Les méthodes légales</w:t>
+      </w:r>
+    </w:p>
+    <w:p>
+      <w:pPr>
+        <w:pStyle w:val="ListParagraph"/>
+        <w:numPr>
+          <w:ilvl w:val="0"/>
+          <w:numId w:val="1"/>
+        </w:numPr>
+        <w:spacing w:after="60" w:line="264"/>
+      </w:pPr>
+      <w:r>
+        <w:rPr>
+          <w:rFonts w:ascii="Calibri" w:cs="Calibri" w:eastAsia="Calibri" w:hAnsi="Calibri"/>
+          <w:sz w:val="22"/>
+          <w:szCs w:val="22"/>
+        </w:rPr>
+        <w:t xml:space="preserve">Code de déblocage de l'opérateur : le propriétaire peut, sous conditions (téléphone payé, délai écoulé), demander gratuitement le déverrouillage à son opérateur. C'est la voie reine.</w:t>
+      </w:r>
+    </w:p>
+    <w:p>
+      <w:pPr>
+        <w:pStyle w:val="ListParagraph"/>
+        <w:numPr>
+          <w:ilvl w:val="0"/>
+          <w:numId w:val="1"/>
+        </w:numPr>
+        <w:spacing w:after="60" w:line="264"/>
+      </w:pPr>
+      <w:r>
+        <w:rPr>
+          <w:rFonts w:ascii="Calibri" w:cs="Calibri" w:eastAsia="Calibri" w:hAnsi="Calibri"/>
+          <w:sz w:val="22"/>
+          <w:szCs w:val="22"/>
+        </w:rPr>
+        <w:t xml:space="preserve">Service de désimlockage par IMEI : des services officiels débloquent « à distance » en enregistrant l'IMEI comme déverrouillé dans les bases constructeur/opérateur. Choisissez des prestataires sérieux et légaux.</w:t>
+      </w:r>
+    </w:p>
+    <w:p>
+      <w:pPr>
+        <w:pStyle w:val="ListParagraph"/>
+        <w:numPr>
+          <w:ilvl w:val="0"/>
+          <w:numId w:val="1"/>
+        </w:numPr>
+        <w:spacing w:after="60" w:line="264"/>
+      </w:pPr>
+      <w:r>
+        <w:rPr>
+          <w:rFonts w:ascii="Calibri" w:cs="Calibri" w:eastAsia="Calibri" w:hAnsi="Calibri"/>
+          <w:sz w:val="22"/>
+          <w:szCs w:val="22"/>
+        </w:rPr>
+        <w:t xml:space="preserve">Passage à l'eSIM / opérateur compatible selon les cas.</w:t>
+      </w:r>
+    </w:p>
+    <w:p>
+      <w:pPr>
+        <w:pStyle w:val="ListParagraph"/>
+        <w:numPr>
+          <w:ilvl w:val="0"/>
+          <w:numId w:val="1"/>
+        </w:numPr>
+        <w:spacing w:after="60" w:line="264"/>
+      </w:pPr>
+      <w:r>
+        <w:rPr>
+          <w:rFonts w:ascii="Calibri" w:cs="Calibri" w:eastAsia="Calibri" w:hAnsi="Calibri"/>
+          <w:sz w:val="22"/>
+          <w:szCs w:val="22"/>
+        </w:rPr>
+        <w:t xml:space="preserve">Dans tous les cas : l'appareil ne doit pas être signalé perdu/volé, et la propriété doit être prouvée.</w:t>
+      </w:r>
+    </w:p>
+    <w:p>
+      <w:pPr>
+        <w:spacing w:after="80"/>
+      </w:pPr>
+    </w:p>
+    <w:p>
+      <w:pPr>
+        <w:spacing w:after="40" w:before="120"/>
+        <w:jc w:val="center"/>
+      </w:pPr>
+      <w:r>
+        <w:drawing>
+          <wp:inline distT="0" distB="0" distL="0" distR="0">
+            <wp:extent cx="4476750" cy="3009900"/>
+            <wp:effectExtent t="0" r="0" b="0" l="0"/>
+            <wp:docPr id="1" name="" descr="" title=""/>
+            <wp:cNvGraphicFramePr>
+              <a:graphicFrameLocks xmlns:a="http://schemas.openxmlformats.org/drawingml/2006/main" noChangeAspect="1"/>
+            </wp:cNvGraphicFramePr>
+            <a:graphic xmlns:a="http://schemas.openxmlformats.org/drawingml/2006/main">
+              <a:graphicData uri="http://schemas.openxmlformats.org/drawingml/2006/picture">
+                <pic:pic xmlns:pic="http://schemas.openxmlformats.org/drawingml/2006/picture">
+                  <pic:nvPicPr>
+                    <pic:cNvPr id="0" name="" descr=""/>
+                    <pic:cNvPicPr>
+                      <a:picLocks noChangeAspect="1" noChangeArrowheads="1"/>
+                    </pic:cNvPicPr>
+                  </pic:nvPicPr>
+                  <pic:blipFill>
+                    <a:blip r:embed="rId16" cstate="none"/>
+                    <a:srcRect/>
+                    <a:stretch>
+                      <a:fillRect/>
+                    </a:stretch>
+                  </pic:blipFill>
+                  <pic:spPr bwMode="auto">
+                    <a:xfrm>
+                      <a:off x="0" y="0"/>
+                      <a:ext cx="4476750" cy="3009900"/>
+                    </a:xfrm>
+                    <a:prstGeom prst="rect">
+                      <a:avLst/>
+                    </a:prstGeom>
+                  </pic:spPr>
+                </pic:pic>
+              </a:graphicData>
+            </a:graphic>
+          </wp:inline>
+        </w:drawing>
+      </w:r>
+    </w:p>
+    <w:p>
+      <w:pPr>
+        <w:spacing w:after="160"/>
+        <w:jc w:val="center"/>
+      </w:pPr>
+      <w:r>
+        <w:rPr>
+          <w:rFonts w:ascii="Calibri" w:cs="Calibri" w:eastAsia="Calibri" w:hAnsi="Calibri"/>
+          <w:i/>
+          <w:iCs/>
+          <w:color w:val="555555"/>
+          <w:sz w:val="17"/>
+          <w:szCs w:val="17"/>
+        </w:rPr>
+        <w:t xml:space="preserve">Les étapes d'un déblocage réseau légal (sur preuve de propriété).</w:t>
+      </w:r>
+    </w:p>
+    <w:p>
+      <w:pPr>
+        <w:pStyle w:val="Heading2"/>
+        <w:spacing w:after="100" w:before="220"/>
+      </w:pPr>
+      <w:r>
+        <w:rPr>
+          <w:rFonts w:ascii="Calibri" w:cs="Calibri" w:eastAsia="Calibri" w:hAnsi="Calibri"/>
+          <w:b/>
+          <w:bCs/>
+          <w:color w:val="2E5E8C"/>
+          <w:sz w:val="26"/>
+          <w:szCs w:val="26"/>
+        </w:rPr>
+        <w:t xml:space="preserve">13. Ce qu'il ne faut jamais faire</w:t>
+      </w:r>
+    </w:p>
+    <w:p>
+      <w:pPr>
+        <w:pStyle w:val="ListParagraph"/>
+        <w:numPr>
+          <w:ilvl w:val="0"/>
+          <w:numId w:val="1"/>
+        </w:numPr>
+        <w:spacing w:after="60" w:line="264"/>
+      </w:pPr>
+      <w:r>
+        <w:rPr>
+          <w:rFonts w:ascii="Calibri" w:cs="Calibri" w:eastAsia="Calibri" w:hAnsi="Calibri"/>
+          <w:sz w:val="22"/>
+          <w:szCs w:val="22"/>
+        </w:rPr>
+        <w:t xml:space="preserve">Débloquer un appareil signalé volé ou perdu (listes noires IMEI) : illégal et traçable.</w:t>
+      </w:r>
+    </w:p>
+    <w:p>
+      <w:pPr>
+        <w:pStyle w:val="ListParagraph"/>
+        <w:numPr>
+          <w:ilvl w:val="0"/>
+          <w:numId w:val="1"/>
+        </w:numPr>
+        <w:spacing w:after="60" w:line="264"/>
+      </w:pPr>
+      <w:r>
+        <w:rPr>
+          <w:rFonts w:ascii="Calibri" w:cs="Calibri" w:eastAsia="Calibri" w:hAnsi="Calibri"/>
+          <w:sz w:val="22"/>
+          <w:szCs w:val="22"/>
+        </w:rPr>
+        <w:t xml:space="preserve">Contourner un verrou de compte (iCloud/FRP) sous couvert de « déblocage » : ce n'est pas du désimlockage, c'est du contournement d'antivol.</w:t>
+      </w:r>
+    </w:p>
+    <w:p>
+      <w:pPr>
+        <w:pStyle w:val="ListParagraph"/>
+        <w:numPr>
+          <w:ilvl w:val="0"/>
+          <w:numId w:val="1"/>
+        </w:numPr>
+        <w:spacing w:after="60" w:line="264"/>
+      </w:pPr>
+      <w:r>
+        <w:rPr>
+          <w:rFonts w:ascii="Calibri" w:cs="Calibri" w:eastAsia="Calibri" w:hAnsi="Calibri"/>
+          <w:sz w:val="22"/>
+          <w:szCs w:val="22"/>
+        </w:rPr>
+        <w:t xml:space="preserve">Modifier l'IMEI pour « sortir » un appareil d'une liste noire : illégal.</w:t>
+      </w:r>
+    </w:p>
+    <w:p>
+      <w:pPr>
+        <w:pStyle w:val="ListParagraph"/>
+        <w:numPr>
+          <w:ilvl w:val="0"/>
+          <w:numId w:val="1"/>
+        </w:numPr>
+        <w:spacing w:after="60" w:line="264"/>
+      </w:pPr>
+      <w:r>
+        <w:rPr>
+          <w:rFonts w:ascii="Calibri" w:cs="Calibri" w:eastAsia="Calibri" w:hAnsi="Calibri"/>
+          <w:sz w:val="22"/>
+          <w:szCs w:val="22"/>
+        </w:rPr>
+        <w:t xml:space="preserve">Accepter un appareil dont le client ne peut prouver la propriété.</w:t>
+      </w:r>
+    </w:p>
+    <w:p>
+      <w:pPr>
+        <w:spacing w:after="80"/>
+      </w:pPr>
+    </w:p>
+    <w:tbl>
+      <w:tblPr>
+        <w:tblW w:type="pct" w:w="100%"/>
+        <w:tblBorders>
+          <w:top w:val="none" w:color="FFFFFF" w:sz="0"/>
+          <w:left w:val="none" w:color="FFFFFF" w:sz="0"/>
+          <w:bottom w:val="none" w:color="FFFFFF" w:sz="0"/>
+          <w:right w:val="none" w:color="FFFFFF" w:sz="0"/>
+          <w:insideH w:val="none" w:color="FFFFFF" w:sz="0"/>
+          <w:insideV w:val="none" w:color="FFFFFF" w:sz="0"/>
+        </w:tblBorders>
+      </w:tblPr>
+      <w:tblGrid>
+        <w:gridCol w:w="200"/>
+        <w:gridCol w:w="9160"/>
+      </w:tblGrid>
+      <w:tr>
+        <w:tc>
+          <w:tcPr>
+            <w:tcW w:type="dxa" w:w="200"/>
+            <w:shd w:fill="2E5E8C" w:color="auto" w:val="clear"/>
+          </w:tcPr>
+          <w:p>
+            <w:r>
+              <w:rPr>
+                <w:rFonts w:ascii="Calibri" w:cs="Calibri" w:eastAsia="Calibri" w:hAnsi="Calibri"/>
+              </w:rPr>
+              <w:t xml:space="preserve"> </w:t>
+            </w:r>
+          </w:p>
+        </w:tc>
+        <w:tc>
+          <w:tcPr>
+            <w:tcW w:type="dxa" w:w="9160"/>
+            <w:shd w:fill="EAF2FB" w:color="auto" w:val="clear"/>
+            <w:tcMar>
+              <w:top w:type="dxa" w:w="120"/>
+              <w:left w:type="dxa" w:w="160"/>
+              <w:bottom w:type="dxa" w:w="120"/>
+              <w:right w:type="dxa" w:w="160"/>
+            </w:tcMar>
+          </w:tcPr>
+          <w:p>
+            <w:pPr>
+              <w:spacing w:after="40"/>
+            </w:pPr>
+            <w:r>
+              <w:rPr>
+                <w:rFonts w:ascii="Calibri" w:cs="Calibri" w:eastAsia="Calibri" w:hAnsi="Calibri"/>
+                <w:b/>
+                <w:bCs/>
+                <w:color w:val="1F3A5F"/>
+                <w:sz w:val="21"/>
+                <w:szCs w:val="21"/>
+              </w:rPr>
+              <w:t xml:space="preserve">La bonne question à poser</w:t>
+            </w:r>
+          </w:p>
+          <w:p>
+            <w:r>
+              <w:rPr>
+                <w:rFonts w:ascii="Calibri" w:cs="Calibri" w:eastAsia="Calibri" w:hAnsi="Calibri"/>
+                <w:color w:val="222222"/>
+                <w:sz w:val="21"/>
+                <w:szCs w:val="21"/>
+              </w:rPr>
+              <w:t xml:space="preserve">« Avez-vous une preuve d'achat / la facture ? » Cette simple question filtre l'essentiel des demandes problématiques et protège votre commerce. En cas de doute, refusez poliment.</w:t>
+            </w:r>
+          </w:p>
+        </w:tc>
+      </w:tr>
+    </w:tbl>
+    <w:p>
+      <w:pPr>
+        <w:spacing w:after="80"/>
+      </w:pPr>
+    </w:p>
+    <w:p>
+      <w:r>
+        <w:br w:type="page"/>
+      </w:r>
+    </w:p>
+    <w:p>
+      <w:r>
+        <w:br w:type="page"/>
+      </w:r>
+    </w:p>
+    <w:p>
+      <w:pPr>
+        <w:pStyle w:val="Heading1"/>
+        <w:spacing w:after="0" w:before="0"/>
+      </w:pPr>
+      <w:r>
+        <w:rPr>
+          <w:rFonts w:ascii="Calibri" w:cs="Calibri" w:eastAsia="Calibri" w:hAnsi="Calibri"/>
+          <w:color w:val="FFFFFF"/>
+          <w:sz w:val="2"/>
+          <w:szCs w:val="2"/>
+        </w:rPr>
+        <w:t xml:space="preserve">Partie 6 — Bootloader, root et ROM personnalisées (Android)</w:t>
+      </w:r>
+    </w:p>
+    <w:tbl>
+      <w:tblPr>
+        <w:tblW w:type="pct" w:w="100%"/>
+        <w:tblBorders>
+          <w:top w:val="none" w:color="FFFFFF" w:sz="0"/>
+          <w:left w:val="none" w:color="FFFFFF" w:sz="0"/>
+          <w:bottom w:val="none" w:color="FFFFFF" w:sz="0"/>
+          <w:right w:val="none" w:color="FFFFFF" w:sz="0"/>
+          <w:insideH w:val="none" w:color="FFFFFF" w:sz="0"/>
+          <w:insideV w:val="none" w:color="FFFFFF" w:sz="0"/>
+        </w:tblBorders>
+      </w:tblPr>
+      <w:tblGrid>
+        <w:gridCol w:w="9360"/>
+      </w:tblGrid>
+      <w:tr>
+        <w:tc>
+          <w:tcPr>
+            <w:tcW w:type="dxa" w:w="9360"/>
+            <w:shd w:fill="1F3A5F" w:color="auto" w:val="clear"/>
+            <w:tcMar>
+              <w:top w:type="dxa" w:w="300"/>
+              <w:left w:type="dxa" w:w="320"/>
+              <w:bottom w:type="dxa" w:w="320"/>
+              <w:right w:type="dxa" w:w="320"/>
+            </w:tcMar>
+          </w:tcPr>
+          <w:p>
+            <w:pPr>
+              <w:spacing w:after="40"/>
+            </w:pPr>
+            <w:r>
+              <w:rPr>
+                <w:rFonts w:ascii="Calibri" w:cs="Calibri" w:eastAsia="Calibri" w:hAnsi="Calibri"/>
+                <w:b/>
+                <w:bCs/>
+                <w:color w:val="9FC4E6"/>
+                <w:spacing w:val="60"/>
+                <w:sz w:val="20"/>
+                <w:szCs w:val="20"/>
+              </w:rPr>
+              <w:t xml:space="preserve">PARTIE 6</w:t>
+            </w:r>
+          </w:p>
+          <w:p>
+            <w:r>
+              <w:rPr>
+                <w:rFonts w:ascii="Calibri" w:cs="Calibri" w:eastAsia="Calibri" w:hAnsi="Calibri"/>
+                <w:b/>
+                <w:bCs/>
+                <w:color w:val="FFFFFF"/>
+                <w:sz w:val="40"/>
+                <w:szCs w:val="40"/>
+              </w:rPr>
+              <w:t xml:space="preserve">Bootloader, root et ROM personnalisées (Android)</w:t>
+            </w:r>
+          </w:p>
+        </w:tc>
+      </w:tr>
+    </w:tbl>
+    <w:p>
+      <w:pPr>
+        <w:spacing w:after="80"/>
+      </w:pPr>
+    </w:p>
+    <w:p>
+      <w:pPr>
+        <w:spacing w:after="120" w:line="276"/>
+        <w:jc w:val="both"/>
+      </w:pPr>
+      <w:r>
+        <w:rPr>
+          <w:rFonts w:ascii="Calibri" w:cs="Calibri" w:eastAsia="Calibri" w:hAnsi="Calibri"/>
+          <w:sz w:val="22"/>
+          <w:szCs w:val="22"/>
+        </w:rPr>
+        <w:t xml:space="preserve">Déverrouiller le bootloader, « rooter » ou installer une ROM personnalisée sont des opérations que le propriétaire peut légitimement demander sur SON appareil. Elles comportent toutefois des contreparties qu'il faut expliquer clairement.</w:t>
+      </w:r>
+    </w:p>
+    <w:p>
+      <w:pPr>
+        <w:pStyle w:val="Heading2"/>
+        <w:spacing w:after="100" w:before="220"/>
+      </w:pPr>
+      <w:r>
+        <w:rPr>
+          <w:rFonts w:ascii="Calibri" w:cs="Calibri" w:eastAsia="Calibri" w:hAnsi="Calibri"/>
+          <w:b/>
+          <w:bCs/>
+          <w:color w:val="2E5E8C"/>
+          <w:sz w:val="26"/>
+          <w:szCs w:val="26"/>
+        </w:rPr>
+        <w:t xml:space="preserve">14. Ce que ça implique</w:t>
+      </w:r>
+    </w:p>
+    <w:p>
+      <w:pPr>
+        <w:pStyle w:val="ListParagraph"/>
+        <w:numPr>
+          <w:ilvl w:val="0"/>
+          <w:numId w:val="1"/>
+        </w:numPr>
+        <w:spacing w:after="60" w:line="264"/>
+      </w:pPr>
+      <w:r>
+        <w:rPr>
+          <w:rFonts w:ascii="Calibri" w:cs="Calibri" w:eastAsia="Calibri" w:hAnsi="Calibri"/>
+          <w:sz w:val="22"/>
+          <w:szCs w:val="22"/>
+        </w:rPr>
+        <w:t xml:space="preserve">Déverrouillage du bootloader : souvent EFFACE toutes les données (sécurité) et peut annuler la garantie.</w:t>
+      </w:r>
+    </w:p>
+    <w:p>
+      <w:pPr>
+        <w:pStyle w:val="ListParagraph"/>
+        <w:numPr>
+          <w:ilvl w:val="0"/>
+          <w:numId w:val="1"/>
+        </w:numPr>
+        <w:spacing w:after="60" w:line="264"/>
+      </w:pPr>
+      <w:r>
+        <w:rPr>
+          <w:rFonts w:ascii="Calibri" w:cs="Calibri" w:eastAsia="Calibri" w:hAnsi="Calibri"/>
+          <w:sz w:val="22"/>
+          <w:szCs w:val="22"/>
+        </w:rPr>
+        <w:t xml:space="preserve">Root / ROM personnalisée : peut casser certaines fonctions (paiement sans contact, applications bancaires, mises à jour officielles) et réduire la sécurité si mal fait.</w:t>
+      </w:r>
+    </w:p>
+    <w:p>
+      <w:pPr>
+        <w:pStyle w:val="ListParagraph"/>
+        <w:numPr>
+          <w:ilvl w:val="0"/>
+          <w:numId w:val="1"/>
+        </w:numPr>
+        <w:spacing w:after="60" w:line="264"/>
+      </w:pPr>
+      <w:r>
+        <w:rPr>
+          <w:rFonts w:ascii="Calibri" w:cs="Calibri" w:eastAsia="Calibri" w:hAnsi="Calibri"/>
+          <w:sz w:val="22"/>
+          <w:szCs w:val="22"/>
+        </w:rPr>
+        <w:t xml:space="preserve">Réversibilité : reverrouiller/revenir au stock est parfois possible, parfois non selon le modèle.</w:t>
+      </w:r>
+    </w:p>
+    <w:p>
+      <w:pPr>
+        <w:pStyle w:val="ListParagraph"/>
+        <w:numPr>
+          <w:ilvl w:val="0"/>
+          <w:numId w:val="1"/>
+        </w:numPr>
+        <w:spacing w:after="60" w:line="264"/>
+      </w:pPr>
+      <w:r>
+        <w:rPr>
+          <w:rFonts w:ascii="Calibri" w:cs="Calibri" w:eastAsia="Calibri" w:hAnsi="Calibri"/>
+          <w:sz w:val="22"/>
+          <w:szCs w:val="22"/>
+        </w:rPr>
+        <w:t xml:space="preserve">Sur beaucoup d'appareils récents, le déverrouillage OEM est bridé par le constructeur.</w:t>
+      </w:r>
+    </w:p>
+    <w:p>
+      <w:pPr>
+        <w:spacing w:after="80"/>
+      </w:pPr>
+    </w:p>
+    <w:tbl>
+      <w:tblPr>
+        <w:tblW w:type="pct" w:w="100%"/>
+        <w:tblBorders>
+          <w:top w:val="none" w:color="FFFFFF" w:sz="0"/>
+          <w:left w:val="none" w:color="FFFFFF" w:sz="0"/>
+          <w:bottom w:val="none" w:color="FFFFFF" w:sz="0"/>
+          <w:right w:val="none" w:color="FFFFFF" w:sz="0"/>
+          <w:insideH w:val="none" w:color="FFFFFF" w:sz="0"/>
+          <w:insideV w:val="none" w:color="FFFFFF" w:sz="0"/>
+        </w:tblBorders>
+      </w:tblPr>
+      <w:tblGrid>
+        <w:gridCol w:w="200"/>
+        <w:gridCol w:w="9160"/>
+      </w:tblGrid>
+      <w:tr>
+        <w:tc>
+          <w:tcPr>
+            <w:tcW w:type="dxa" w:w="200"/>
+            <w:shd w:fill="27AE60" w:color="auto" w:val="clear"/>
+          </w:tcPr>
+          <w:p>
+            <w:r>
+              <w:rPr>
+                <w:rFonts w:ascii="Calibri" w:cs="Calibri" w:eastAsia="Calibri" w:hAnsi="Calibri"/>
+              </w:rPr>
+              <w:t xml:space="preserve"> </w:t>
+            </w:r>
+          </w:p>
+        </w:tc>
+        <w:tc>
+          <w:tcPr>
+            <w:tcW w:type="dxa" w:w="9160"/>
+            <w:shd w:fill="EAF7EE" w:color="auto" w:val="clear"/>
+            <w:tcMar>
+              <w:top w:type="dxa" w:w="120"/>
+              <w:left w:type="dxa" w:w="160"/>
+              <w:bottom w:type="dxa" w:w="120"/>
+              <w:right w:type="dxa" w:w="160"/>
+            </w:tcMar>
+          </w:tcPr>
+          <w:p>
+            <w:pPr>
+              <w:spacing w:after="40"/>
+            </w:pPr>
+            <w:r>
+              <w:rPr>
+                <w:rFonts w:ascii="Calibri" w:cs="Calibri" w:eastAsia="Calibri" w:hAnsi="Calibri"/>
+                <w:b/>
+                <w:bCs/>
+                <w:color w:val="1E7E42"/>
+                <w:sz w:val="21"/>
+                <w:szCs w:val="21"/>
+              </w:rPr>
+              <w:t xml:space="preserve">Devoir de conseil</w:t>
+            </w:r>
+          </w:p>
+          <w:p>
+            <w:r>
+              <w:rPr>
+                <w:rFonts w:ascii="Calibri" w:cs="Calibri" w:eastAsia="Calibri" w:hAnsi="Calibri"/>
+                <w:color w:val="222222"/>
+                <w:sz w:val="21"/>
+                <w:szCs w:val="21"/>
+              </w:rPr>
+              <w:t xml:space="preserve">Avant toute manipulation « avancée », expliquez au client les risques (garantie, sécurité, fonctions bancaires) et faites-lui confirmer par écrit. C'est un service légitime, mais le client doit décider en connaissance de cause.</w:t>
+            </w:r>
+          </w:p>
+        </w:tc>
+      </w:tr>
+    </w:tbl>
+    <w:p>
+      <w:pPr>
+        <w:spacing w:after="80"/>
+      </w:pPr>
+    </w:p>
+    <w:p>
+      <w:r>
+        <w:br w:type="page"/>
+      </w:r>
+    </w:p>
+    <w:p>
+      <w:r>
+        <w:br w:type="page"/>
+      </w:r>
+    </w:p>
+    <w:p>
+      <w:pPr>
+        <w:pStyle w:val="Heading1"/>
+        <w:spacing w:after="0" w:before="0"/>
+      </w:pPr>
+      <w:r>
+        <w:rPr>
+          <w:rFonts w:ascii="Calibri" w:cs="Calibri" w:eastAsia="Calibri" w:hAnsi="Calibri"/>
+          <w:color w:val="FFFFFF"/>
+          <w:sz w:val="2"/>
+          <w:szCs w:val="2"/>
+        </w:rPr>
+        <w:t xml:space="preserve">Partie 7 — Dépannage : bootloop, brick, échecs de flash</w:t>
+      </w:r>
+    </w:p>
+    <w:tbl>
+      <w:tblPr>
+        <w:tblW w:type="pct" w:w="100%"/>
+        <w:tblBorders>
+          <w:top w:val="none" w:color="FFFFFF" w:sz="0"/>
+          <w:left w:val="none" w:color="FFFFFF" w:sz="0"/>
+          <w:bottom w:val="none" w:color="FFFFFF" w:sz="0"/>
+          <w:right w:val="none" w:color="FFFFFF" w:sz="0"/>
+          <w:insideH w:val="none" w:color="FFFFFF" w:sz="0"/>
+          <w:insideV w:val="none" w:color="FFFFFF" w:sz="0"/>
+        </w:tblBorders>
+      </w:tblPr>
+      <w:tblGrid>
+        <w:gridCol w:w="9360"/>
+      </w:tblGrid>
+      <w:tr>
+        <w:tc>
+          <w:tcPr>
+            <w:tcW w:type="dxa" w:w="9360"/>
+            <w:shd w:fill="1F3A5F" w:color="auto" w:val="clear"/>
+            <w:tcMar>
+              <w:top w:type="dxa" w:w="300"/>
+              <w:left w:type="dxa" w:w="320"/>
+              <w:bottom w:type="dxa" w:w="320"/>
+              <w:right w:type="dxa" w:w="320"/>
+            </w:tcMar>
+          </w:tcPr>
+          <w:p>
+            <w:pPr>
+              <w:spacing w:after="40"/>
+            </w:pPr>
+            <w:r>
+              <w:rPr>
+                <w:rFonts w:ascii="Calibri" w:cs="Calibri" w:eastAsia="Calibri" w:hAnsi="Calibri"/>
+                <w:b/>
+                <w:bCs/>
+                <w:color w:val="9FC4E6"/>
+                <w:spacing w:val="60"/>
+                <w:sz w:val="20"/>
+                <w:szCs w:val="20"/>
+              </w:rPr>
+              <w:t xml:space="preserve">PARTIE 7</w:t>
+            </w:r>
+          </w:p>
+          <w:p>
+            <w:r>
+              <w:rPr>
+                <w:rFonts w:ascii="Calibri" w:cs="Calibri" w:eastAsia="Calibri" w:hAnsi="Calibri"/>
+                <w:b/>
+                <w:bCs/>
+                <w:color w:val="FFFFFF"/>
+                <w:sz w:val="40"/>
+                <w:szCs w:val="40"/>
+              </w:rPr>
+              <w:t xml:space="preserve">Dépannage : bootloop, brick, échecs de flash</w:t>
+            </w:r>
+          </w:p>
+        </w:tc>
+      </w:tr>
+    </w:tbl>
+    <w:p>
+      <w:pPr>
+        <w:spacing w:after="80"/>
+      </w:pPr>
+    </w:p>
+    <w:p>
+      <w:pPr>
+        <w:spacing w:after="120" w:line="276"/>
+        <w:jc w:val="both"/>
+      </w:pPr>
+      <w:r>
+        <w:rPr>
+          <w:rFonts w:ascii="Calibri" w:cs="Calibri" w:eastAsia="Calibri" w:hAnsi="Calibri"/>
+          <w:sz w:val="22"/>
+          <w:szCs w:val="22"/>
+        </w:rPr>
+        <w:t xml:space="preserve">Un appareil « bloqué au logo », qui redémarre en boucle (bootloop) ou totalement éteint (brick) est très souvent récupérable par voie logicielle. Méthode :</w:t>
+      </w:r>
+    </w:p>
+    <w:p>
+      <w:pPr>
+        <w:spacing w:after="40" w:before="120"/>
+        <w:jc w:val="center"/>
+      </w:pPr>
+      <w:r>
+        <w:drawing>
+          <wp:inline distT="0" distB="0" distL="0" distR="0">
+            <wp:extent cx="4476750" cy="2143125"/>
+            <wp:effectExtent t="0" r="0" b="0" l="0"/>
+            <wp:docPr id="1" name="" descr="" title=""/>
+            <wp:cNvGraphicFramePr>
+              <a:graphicFrameLocks xmlns:a="http://schemas.openxmlformats.org/drawingml/2006/main" noChangeAspect="1"/>
+            </wp:cNvGraphicFramePr>
+            <a:graphic xmlns:a="http://schemas.openxmlformats.org/drawingml/2006/main">
+              <a:graphicData uri="http://schemas.openxmlformats.org/drawingml/2006/picture">
+                <pic:pic xmlns:pic="http://schemas.openxmlformats.org/drawingml/2006/picture">
+                  <pic:nvPicPr>
+                    <pic:cNvPr id="0" name="" descr=""/>
+                    <pic:cNvPicPr>
+                      <a:picLocks noChangeAspect="1" noChangeArrowheads="1"/>
+                    </pic:cNvPicPr>
+                  </pic:nvPicPr>
+                  <pic:blipFill>
+                    <a:blip r:embed="rId17" cstate="none"/>
+                    <a:srcRect/>
+                    <a:stretch>
+                      <a:fillRect/>
+                    </a:stretch>
+                  </pic:blipFill>
+                  <pic:spPr bwMode="auto">
+                    <a:xfrm>
+                      <a:off x="0" y="0"/>
                       <a:ext cx="4476750" cy="2143125"/>
                     </a:xfrm>
                     <a:prstGeom prst="rect">
@@ -3837,6 +4089,69 @@
       <w:pPr>
         <w:spacing w:after="80"/>
       </w:pPr>
+    </w:p>
+    <w:p>
+      <w:pPr>
+        <w:spacing w:after="40" w:before="120"/>
+        <w:jc w:val="center"/>
+      </w:pPr>
+      <w:r>
+        <w:drawing>
+          <wp:inline distT="0" distB="0" distL="0" distR="0">
+            <wp:extent cx="4476750" cy="3009900"/>
+            <wp:effectExtent t="0" r="0" b="0" l="0"/>
+            <wp:docPr id="1" name="" descr="" title=""/>
+            <wp:cNvGraphicFramePr>
+              <a:graphicFrameLocks xmlns:a="http://schemas.openxmlformats.org/drawingml/2006/main" noChangeAspect="1"/>
+            </wp:cNvGraphicFramePr>
+            <a:graphic xmlns:a="http://schemas.openxmlformats.org/drawingml/2006/main">
+              <a:graphicData uri="http://schemas.openxmlformats.org/drawingml/2006/picture">
+                <pic:pic xmlns:pic="http://schemas.openxmlformats.org/drawingml/2006/picture">
+                  <pic:nvPicPr>
+                    <pic:cNvPr id="0" name="" descr=""/>
+                    <pic:cNvPicPr>
+                      <a:picLocks noChangeAspect="1" noChangeArrowheads="1"/>
+                    </pic:cNvPicPr>
+                  </pic:nvPicPr>
+                  <pic:blipFill>
+                    <a:blip r:embed="rId18" cstate="none"/>
+                    <a:srcRect/>
+                    <a:stretch>
+                      <a:fillRect/>
+                    </a:stretch>
+                  </pic:blipFill>
+                  <pic:spPr bwMode="auto">
+                    <a:xfrm>
+                      <a:off x="0" y="0"/>
+                      <a:ext cx="4476750" cy="3009900"/>
+                    </a:xfrm>
+                    <a:prstGeom prst="rect">
+                      <a:avLst/>
+                    </a:prstGeom>
+                  </pic:spPr>
+                </pic:pic>
+              </a:graphicData>
+            </a:graphic>
+          </wp:inline>
+        </w:drawing>
+      </w:r>
+    </w:p>
+    <w:p>
+      <w:pPr>
+        <w:spacing w:after="160"/>
+        <w:jc w:val="center"/>
+      </w:pPr>
+      <w:r>
+        <w:rPr>
+          <w:rFonts w:ascii="Calibri" w:cs="Calibri" w:eastAsia="Calibri" w:hAnsi="Calibri"/>
+          <w:i/>
+          <w:iCs/>
+          <w:color w:val="555555"/>
+          <w:sz w:val="17"/>
+          <w:szCs w:val="17"/>
+        </w:rPr>
+        <w:t xml:space="preserve">Les étapes pour sortir un appareil d'un bootloop par voie logicielle.</w:t>
+      </w:r>
     </w:p>
     <w:tbl>
       <w:tblPr>
@@ -4043,7 +4358,7 @@
                     </pic:cNvPicPr>
                   </pic:nvPicPr>
                   <pic:blipFill>
-                    <a:blip r:embed="rId14" cstate="none"/>
+                    <a:blip r:embed="rId19" cstate="none"/>
                     <a:srcRect/>
                     <a:stretch>
                       <a:fillRect/>

</xml_diff>